<commit_message>
Ata de Reunião: transcrição manual via Drive e Anexo A como imagem
Prioriza uma transcrição escrita à mão pelo Wallace (arquivo com
"transcri" no nome, na pasta do mês no Drive) sobre a transcrição
automática por áudio/Whisper, que vira só um fallback. O Anexo A
(Controle de Devoluções/Empréstimos) agora é renderizado como imagem
(Pillow) em vez de tabela nativa do Word, igual ao formato da Ata
assinada de maio.

Co-Authored-By: Claude Sonnet 5 <noreply@anthropic.com>
</commit_message>
<xml_diff>
--- a/Contrato 005/Dashboard/02_Dados_Tratados/atas/Ata_RMA_Junho_2026_rascunho.docx
+++ b/Contrato 005/Dashboard/02_Dados_Tratados/atas/Ata_RMA_Junho_2026_rascunho.docx
@@ -1112,4559 +1112,42 @@
         <w:t>Contrato nº 005/CELOG-PAMALS/2025 — Junho de 2026</w:t>
       </w:r>
     </w:p>
-    <w:tbl>
-      <w:tblPr>
-        <w:tblStyle w:val="TableGrid"/>
-        <w:tblW w:type="auto" w:w="0"/>
-        <w:tblLook w:firstColumn="1" w:firstRow="1" w:lastColumn="0" w:lastRow="0" w:noHBand="0" w:noVBand="1" w:val="04A0"/>
-      </w:tblPr>
-      <w:tblGrid>
-        <w:gridCol w:w="960"/>
-        <w:gridCol w:w="960"/>
-        <w:gridCol w:w="960"/>
-        <w:gridCol w:w="960"/>
-        <w:gridCol w:w="960"/>
-        <w:gridCol w:w="960"/>
-        <w:gridCol w:w="960"/>
-        <w:gridCol w:w="960"/>
-        <w:gridCol w:w="960"/>
-      </w:tblGrid>
-      <w:tr>
-        <w:tc>
-          <w:tcPr>
-            <w:tcW w:type="dxa" w:w="960"/>
-          </w:tcPr>
-          <w:p>
-            <w:r>
-              <w:rPr>
-                <w:b/>
-              </w:rPr>
-              <w:t>numero_ordem</w:t>
-            </w:r>
-          </w:p>
-        </w:tc>
-        <w:tc>
-          <w:tcPr>
-            <w:tcW w:type="dxa" w:w="960"/>
-          </w:tcPr>
-          <w:p>
-            <w:r>
-              <w:rPr>
-                <w:b/>
-              </w:rPr>
-              <w:t>part_number</w:t>
-            </w:r>
-          </w:p>
-        </w:tc>
-        <w:tc>
-          <w:tcPr>
-            <w:tcW w:type="dxa" w:w="960"/>
-          </w:tcPr>
-          <w:p>
-            <w:r>
-              <w:rPr>
-                <w:b/>
-              </w:rPr>
-              <w:t>descricao</w:t>
-            </w:r>
-          </w:p>
-        </w:tc>
-        <w:tc>
-          <w:tcPr>
-            <w:tcW w:type="dxa" w:w="960"/>
-          </w:tcPr>
-          <w:p>
-            <w:r>
-              <w:rPr>
-                <w:b/>
-              </w:rPr>
-              <w:t>quantidade_texto</w:t>
-            </w:r>
-          </w:p>
-        </w:tc>
-        <w:tc>
-          <w:tcPr>
-            <w:tcW w:type="dxa" w:w="960"/>
-          </w:tcPr>
-          <w:p>
-            <w:r>
-              <w:rPr>
-                <w:b/>
-              </w:rPr>
-              <w:t>pedido_emg</w:t>
-            </w:r>
-          </w:p>
-        </w:tc>
-        <w:tc>
-          <w:tcPr>
-            <w:tcW w:type="dxa" w:w="960"/>
-          </w:tcPr>
-          <w:p>
-            <w:r>
-              <w:rPr>
-                <w:b/>
-              </w:rPr>
-              <w:t>motivo</w:t>
-            </w:r>
-          </w:p>
-        </w:tc>
-        <w:tc>
-          <w:tcPr>
-            <w:tcW w:type="dxa" w:w="960"/>
-          </w:tcPr>
-          <w:p>
-            <w:r>
-              <w:rPr>
-                <w:b/>
-              </w:rPr>
-              <w:t>anv</w:t>
-            </w:r>
-          </w:p>
-        </w:tc>
-        <w:tc>
-          <w:tcPr>
-            <w:tcW w:type="dxa" w:w="960"/>
-          </w:tcPr>
-          <w:p>
-            <w:r>
-              <w:rPr>
-                <w:b/>
-              </w:rPr>
-              <w:t>destino</w:t>
-            </w:r>
-          </w:p>
-        </w:tc>
-        <w:tc>
-          <w:tcPr>
-            <w:tcW w:type="dxa" w:w="960"/>
-          </w:tcPr>
-          <w:p>
-            <w:r>
-              <w:rPr>
-                <w:b/>
-              </w:rPr>
-              <w:t>status</w:t>
-            </w:r>
-          </w:p>
-        </w:tc>
-      </w:tr>
-      <w:tr>
-        <w:tc>
-          <w:tcPr>
-            <w:tcW w:type="dxa" w:w="960"/>
-          </w:tcPr>
-          <w:p>
-            <w:r>
-              <w:t>264</w:t>
-            </w:r>
-          </w:p>
-        </w:tc>
-        <w:tc>
-          <w:tcPr>
-            <w:tcW w:type="dxa" w:w="960"/>
-          </w:tcPr>
-          <w:p>
-            <w:r>
-              <w:t>S3326-2</w:t>
-            </w:r>
-          </w:p>
-        </w:tc>
-        <w:tc>
-          <w:tcPr>
-            <w:tcW w:type="dxa" w:w="960"/>
-          </w:tcPr>
-          <w:p>
-            <w:r>
-              <w:t>INDICATOR,HORIZONTAL SITUATION</w:t>
-            </w:r>
-          </w:p>
-        </w:tc>
-        <w:tc>
-          <w:tcPr>
-            <w:tcW w:type="dxa" w:w="960"/>
-          </w:tcPr>
-          <w:p>
-            <w:r>
-              <w:t>01 EA</w:t>
-            </w:r>
-          </w:p>
-        </w:tc>
-        <w:tc>
-          <w:tcPr>
-            <w:tcW w:type="dxa" w:w="960"/>
-          </w:tcPr>
-          <w:p>
-            <w:r>
-              <w:t>396260016501</w:t>
-            </w:r>
-          </w:p>
-        </w:tc>
-        <w:tc>
-          <w:tcPr>
-            <w:tcW w:type="dxa" w:w="960"/>
-          </w:tcPr>
-          <w:p>
-            <w:r>
-              <w:t>Atendimento de emergência solicitado pelo SO Cláudio.</w:t>
-            </w:r>
-          </w:p>
-        </w:tc>
-        <w:tc>
-          <w:tcPr>
-            <w:tcW w:type="dxa" w:w="960"/>
-          </w:tcPr>
-          <w:p>
-            <w:r>
-              <w:t>2731</w:t>
-            </w:r>
-          </w:p>
-        </w:tc>
-        <w:tc>
-          <w:tcPr>
-            <w:tcW w:type="dxa" w:w="960"/>
-          </w:tcPr>
-          <w:p>
-            <w:r>
-              <w:t>BABE</w:t>
-            </w:r>
-          </w:p>
-        </w:tc>
-        <w:tc>
-          <w:tcPr>
-            <w:tcW w:type="dxa" w:w="960"/>
-          </w:tcPr>
-          <w:p>
-            <w:r>
-              <w:t>Pendente</w:t>
-            </w:r>
-          </w:p>
-        </w:tc>
-      </w:tr>
-      <w:tr>
-        <w:tc>
-          <w:tcPr>
-            <w:tcW w:type="dxa" w:w="960"/>
-          </w:tcPr>
-          <w:p>
-            <w:r>
-              <w:t>265</w:t>
-            </w:r>
-          </w:p>
-        </w:tc>
-        <w:tc>
-          <w:tcPr>
-            <w:tcW w:type="dxa" w:w="960"/>
-          </w:tcPr>
-          <w:p>
-            <w:r>
-              <w:t>S2502-3</w:t>
-            </w:r>
-          </w:p>
-        </w:tc>
-        <w:tc>
-          <w:tcPr>
-            <w:tcW w:type="dxa" w:w="960"/>
-          </w:tcPr>
-          <w:p>
-            <w:r>
-              <w:t>CONNECTOR,ELECTRICAL</w:t>
-            </w:r>
-          </w:p>
-        </w:tc>
-        <w:tc>
-          <w:tcPr>
-            <w:tcW w:type="dxa" w:w="960"/>
-          </w:tcPr>
-          <w:p>
-            <w:r>
-              <w:t>02 EA</w:t>
-            </w:r>
-          </w:p>
-        </w:tc>
-        <w:tc>
-          <w:tcPr>
-            <w:tcW w:type="dxa" w:w="960"/>
-          </w:tcPr>
-          <w:p>
-            <w:r>
-              <w:t>396260016502</w:t>
-            </w:r>
-          </w:p>
-        </w:tc>
-        <w:tc>
-          <w:tcPr>
-            <w:tcW w:type="dxa" w:w="960"/>
-          </w:tcPr>
-          <w:p>
-            <w:r>
-              <w:t>Atendimento de emergência solicitado pelo SO Cláudio.</w:t>
-            </w:r>
-          </w:p>
-        </w:tc>
-        <w:tc>
-          <w:tcPr>
-            <w:tcW w:type="dxa" w:w="960"/>
-          </w:tcPr>
-          <w:p>
-            <w:r>
-              <w:t>2731</w:t>
-            </w:r>
-          </w:p>
-        </w:tc>
-        <w:tc>
-          <w:tcPr>
-            <w:tcW w:type="dxa" w:w="960"/>
-          </w:tcPr>
-          <w:p>
-            <w:r>
-              <w:t>BABE</w:t>
-            </w:r>
-          </w:p>
-        </w:tc>
-        <w:tc>
-          <w:tcPr>
-            <w:tcW w:type="dxa" w:w="960"/>
-          </w:tcPr>
-          <w:p>
-            <w:r>
-              <w:t>Pendente</w:t>
-            </w:r>
-          </w:p>
-        </w:tc>
-      </w:tr>
-      <w:tr>
-        <w:tc>
-          <w:tcPr>
-            <w:tcW w:type="dxa" w:w="960"/>
-          </w:tcPr>
-          <w:p>
-            <w:r>
-              <w:t>266</w:t>
-            </w:r>
-          </w:p>
-        </w:tc>
-        <w:tc>
-          <w:tcPr>
-            <w:tcW w:type="dxa" w:w="960"/>
-          </w:tcPr>
-          <w:p>
-            <w:r>
-              <w:t>P860037</w:t>
-            </w:r>
-          </w:p>
-        </w:tc>
-        <w:tc>
-          <w:tcPr>
-            <w:tcW w:type="dxa" w:w="960"/>
-          </w:tcPr>
-          <w:p>
-            <w:r>
-              <w:t>SEAL</w:t>
-            </w:r>
-          </w:p>
-        </w:tc>
-        <w:tc>
-          <w:tcPr>
-            <w:tcW w:type="dxa" w:w="960"/>
-          </w:tcPr>
-          <w:p>
-            <w:r>
-              <w:t>02 EA</w:t>
-            </w:r>
-          </w:p>
-        </w:tc>
-        <w:tc>
-          <w:tcPr>
-            <w:tcW w:type="dxa" w:w="960"/>
-          </w:tcPr>
-          <w:p>
-            <w:r>
-              <w:t>396260016500</w:t>
-            </w:r>
-          </w:p>
-        </w:tc>
-        <w:tc>
-          <w:tcPr>
-            <w:tcW w:type="dxa" w:w="960"/>
-          </w:tcPr>
-          <w:p>
-            <w:r>
-              <w:t>Atendimento de emergência solicitado pelo SO Cláudio.</w:t>
-            </w:r>
-          </w:p>
-        </w:tc>
-        <w:tc>
-          <w:tcPr>
-            <w:tcW w:type="dxa" w:w="960"/>
-          </w:tcPr>
-          <w:p>
-            <w:r>
-              <w:t>2733</w:t>
-            </w:r>
-          </w:p>
-        </w:tc>
-        <w:tc>
-          <w:tcPr>
-            <w:tcW w:type="dxa" w:w="960"/>
-          </w:tcPr>
-          <w:p>
-            <w:r>
-              <w:t>BABE</w:t>
-            </w:r>
-          </w:p>
-        </w:tc>
-        <w:tc>
-          <w:tcPr>
-            <w:tcW w:type="dxa" w:w="960"/>
-          </w:tcPr>
-          <w:p>
-            <w:r>
-              <w:t>Pendente</w:t>
-            </w:r>
-          </w:p>
-        </w:tc>
-      </w:tr>
-      <w:tr>
-        <w:tc>
-          <w:tcPr>
-            <w:tcW w:type="dxa" w:w="960"/>
-          </w:tcPr>
-          <w:p>
-            <w:r>
-              <w:t>267</w:t>
-            </w:r>
-          </w:p>
-        </w:tc>
-        <w:tc>
-          <w:tcPr>
-            <w:tcW w:type="dxa" w:w="960"/>
-          </w:tcPr>
-          <w:p>
-            <w:r>
-              <w:t>AE3663231B0160</w:t>
-            </w:r>
-          </w:p>
-        </w:tc>
-        <w:tc>
-          <w:tcPr>
-            <w:tcW w:type="dxa" w:w="960"/>
-          </w:tcPr>
-          <w:p>
-            <w:r>
-              <w:t>HOSE AY</w:t>
-            </w:r>
-          </w:p>
-        </w:tc>
-        <w:tc>
-          <w:tcPr>
-            <w:tcW w:type="dxa" w:w="960"/>
-          </w:tcPr>
-          <w:p>
-            <w:r>
-              <w:t>03 EA</w:t>
-            </w:r>
-          </w:p>
-        </w:tc>
-        <w:tc>
-          <w:tcPr>
-            <w:tcW w:type="dxa" w:w="960"/>
-          </w:tcPr>
-          <w:p>
-            <w:r>
-              <w:t>17624839</w:t>
-            </w:r>
-          </w:p>
-        </w:tc>
-        <w:tc>
-          <w:tcPr>
-            <w:tcW w:type="dxa" w:w="960"/>
-          </w:tcPr>
-          <w:p>
-            <w:r>
-              <w:t>Atender demadna da BAMN, todas as mangueiras deterioadas.</w:t>
-            </w:r>
-          </w:p>
-        </w:tc>
-        <w:tc>
-          <w:tcPr>
-            <w:tcW w:type="dxa" w:w="960"/>
-          </w:tcPr>
-          <w:p>
-            <w:r>
-              <w:t>2736 / 2738 / 2741</w:t>
-            </w:r>
-          </w:p>
-        </w:tc>
-        <w:tc>
-          <w:tcPr>
-            <w:tcW w:type="dxa" w:w="960"/>
-          </w:tcPr>
-          <w:p>
-            <w:r>
-              <w:t>BAMN</w:t>
-            </w:r>
-          </w:p>
-        </w:tc>
-        <w:tc>
-          <w:tcPr>
-            <w:tcW w:type="dxa" w:w="960"/>
-          </w:tcPr>
-          <w:p>
-            <w:r>
-              <w:t>Pendente</w:t>
-            </w:r>
-          </w:p>
-        </w:tc>
-      </w:tr>
-      <w:tr>
-        <w:tc>
-          <w:tcPr>
-            <w:tcW w:type="dxa" w:w="960"/>
-          </w:tcPr>
-          <w:p>
-            <w:r>
-              <w:t>268</w:t>
-            </w:r>
-          </w:p>
-        </w:tc>
-        <w:tc>
-          <w:tcPr>
-            <w:tcW w:type="dxa" w:w="960"/>
-          </w:tcPr>
-          <w:p>
-            <w:r>
-              <w:t>8210-002-01</w:t>
-            </w:r>
-          </w:p>
-        </w:tc>
-        <w:tc>
-          <w:tcPr>
-            <w:tcW w:type="dxa" w:w="960"/>
-          </w:tcPr>
-          <w:p>
-            <w:r>
-              <w:t>GOVERNADOR DE HÉLICE</w:t>
-            </w:r>
-          </w:p>
-        </w:tc>
-        <w:tc>
-          <w:tcPr>
-            <w:tcW w:type="dxa" w:w="960"/>
-          </w:tcPr>
-          <w:p>
-            <w:r>
-              <w:t>01 EA</w:t>
-            </w:r>
-          </w:p>
-        </w:tc>
-        <w:tc>
-          <w:tcPr>
-            <w:tcW w:type="dxa" w:w="960"/>
-          </w:tcPr>
-          <w:p>
-            <w:r>
-              <w:t>17600735</w:t>
-            </w:r>
-          </w:p>
-        </w:tc>
-        <w:tc>
-          <w:tcPr>
-            <w:tcW w:type="dxa" w:w="960"/>
-          </w:tcPr>
-          <w:p>
-            <w:r>
-              <w:t>Atender demanda do 2721 durante inspeção e aproveitamento de missão CAN.</w:t>
-            </w:r>
-          </w:p>
-        </w:tc>
-        <w:tc>
-          <w:tcPr>
-            <w:tcW w:type="dxa" w:w="960"/>
-          </w:tcPr>
-          <w:p>
-            <w:r>
-              <w:t>2721</w:t>
-            </w:r>
-          </w:p>
-        </w:tc>
-        <w:tc>
-          <w:tcPr>
-            <w:tcW w:type="dxa" w:w="960"/>
-          </w:tcPr>
-          <w:p>
-            <w:r>
-              <w:t>BABR</w:t>
-            </w:r>
-          </w:p>
-        </w:tc>
-        <w:tc>
-          <w:tcPr>
-            <w:tcW w:type="dxa" w:w="960"/>
-          </w:tcPr>
-          <w:p>
-            <w:r>
-              <w:t>Pendente</w:t>
-            </w:r>
-          </w:p>
-        </w:tc>
-      </w:tr>
-      <w:tr>
-        <w:tc>
-          <w:tcPr>
-            <w:tcW w:type="dxa" w:w="960"/>
-          </w:tcPr>
-          <w:p>
-            <w:r>
-              <w:t>269</w:t>
-            </w:r>
-          </w:p>
-        </w:tc>
-        <w:tc>
-          <w:tcPr>
-            <w:tcW w:type="dxa" w:w="960"/>
-          </w:tcPr>
-          <w:p>
-            <w:r>
-              <w:t>DCN4-3807</w:t>
-            </w:r>
-          </w:p>
-        </w:tc>
-        <w:tc>
-          <w:tcPr>
-            <w:tcW w:type="dxa" w:w="960"/>
-          </w:tcPr>
-          <w:p>
-            <w:r>
-              <w:t>ANEL DE VEDAÇÃO</w:t>
-            </w:r>
-          </w:p>
-        </w:tc>
-        <w:tc>
-          <w:tcPr>
-            <w:tcW w:type="dxa" w:w="960"/>
-          </w:tcPr>
-          <w:p>
-            <w:r>
-              <w:t>02 EA</w:t>
-            </w:r>
-          </w:p>
-        </w:tc>
-        <w:tc>
-          <w:tcPr>
-            <w:tcW w:type="dxa" w:w="960"/>
-          </w:tcPr>
-          <w:p>
-            <w:r>
-              <w:t>17588026</w:t>
-            </w:r>
-          </w:p>
-        </w:tc>
-        <w:tc>
-          <w:tcPr>
-            <w:tcW w:type="dxa" w:w="960"/>
-          </w:tcPr>
-          <w:p>
-            <w:r>
-              <w:t>Atender demanda do 2721 durante inspeção e aproveitamento de missão CAN.</w:t>
-            </w:r>
-          </w:p>
-        </w:tc>
-        <w:tc>
-          <w:tcPr>
-            <w:tcW w:type="dxa" w:w="960"/>
-          </w:tcPr>
-          <w:p>
-            <w:r>
-              <w:t>2721</w:t>
-            </w:r>
-          </w:p>
-        </w:tc>
-        <w:tc>
-          <w:tcPr>
-            <w:tcW w:type="dxa" w:w="960"/>
-          </w:tcPr>
-          <w:p>
-            <w:r>
-              <w:t>BABR</w:t>
-            </w:r>
-          </w:p>
-        </w:tc>
-        <w:tc>
-          <w:tcPr>
-            <w:tcW w:type="dxa" w:w="960"/>
-          </w:tcPr>
-          <w:p>
-            <w:r>
-              <w:t>Pendente</w:t>
-            </w:r>
-          </w:p>
-        </w:tc>
-      </w:tr>
-      <w:tr>
-        <w:tc>
-          <w:tcPr>
-            <w:tcW w:type="dxa" w:w="960"/>
-          </w:tcPr>
-          <w:p>
-            <w:r>
-              <w:t>270</w:t>
-            </w:r>
-          </w:p>
-        </w:tc>
-        <w:tc>
-          <w:tcPr>
-            <w:tcW w:type="dxa" w:w="960"/>
-          </w:tcPr>
-          <w:p>
-            <w:r>
-              <w:t>MS28773-05</w:t>
-            </w:r>
-          </w:p>
-        </w:tc>
-        <w:tc>
-          <w:tcPr>
-            <w:tcW w:type="dxa" w:w="960"/>
-          </w:tcPr>
-          <w:p>
-            <w:r>
-              <w:t>RETAINER,PACKING</w:t>
-            </w:r>
-          </w:p>
-        </w:tc>
-        <w:tc>
-          <w:tcPr>
-            <w:tcW w:type="dxa" w:w="960"/>
-          </w:tcPr>
-          <w:p>
-            <w:r>
-              <w:t>02 EA</w:t>
-            </w:r>
-          </w:p>
-        </w:tc>
-        <w:tc>
-          <w:tcPr>
-            <w:tcW w:type="dxa" w:w="960"/>
-          </w:tcPr>
-          <w:p>
-            <w:r>
-              <w:t>17588299</w:t>
-            </w:r>
-          </w:p>
-        </w:tc>
-        <w:tc>
-          <w:tcPr>
-            <w:tcW w:type="dxa" w:w="960"/>
-          </w:tcPr>
-          <w:p>
-            <w:r>
-              <w:t>Atender demanda do 2721 durante inspeção e aproveitamento de missão CAN.</w:t>
-            </w:r>
-          </w:p>
-        </w:tc>
-        <w:tc>
-          <w:tcPr>
-            <w:tcW w:type="dxa" w:w="960"/>
-          </w:tcPr>
-          <w:p>
-            <w:r>
-              <w:t>2721</w:t>
-            </w:r>
-          </w:p>
-        </w:tc>
-        <w:tc>
-          <w:tcPr>
-            <w:tcW w:type="dxa" w:w="960"/>
-          </w:tcPr>
-          <w:p>
-            <w:r>
-              <w:t>BABR</w:t>
-            </w:r>
-          </w:p>
-        </w:tc>
-        <w:tc>
-          <w:tcPr>
-            <w:tcW w:type="dxa" w:w="960"/>
-          </w:tcPr>
-          <w:p>
-            <w:r>
-              <w:t>Pendente</w:t>
-            </w:r>
-          </w:p>
-        </w:tc>
-      </w:tr>
-      <w:tr>
-        <w:tc>
-          <w:tcPr>
-            <w:tcW w:type="dxa" w:w="960"/>
-          </w:tcPr>
-          <w:p>
-            <w:r>
-              <w:t>271</w:t>
-            </w:r>
-          </w:p>
-        </w:tc>
-        <w:tc>
-          <w:tcPr>
-            <w:tcW w:type="dxa" w:w="960"/>
-          </w:tcPr>
-          <w:p>
-            <w:r>
-              <w:t>1215073-28</w:t>
-            </w:r>
-          </w:p>
-        </w:tc>
-        <w:tc>
-          <w:tcPr>
-            <w:tcW w:type="dxa" w:w="960"/>
-          </w:tcPr>
-          <w:p>
-            <w:r>
-              <w:t>HEADREST ASSEMBLY</w:t>
-            </w:r>
-          </w:p>
-        </w:tc>
-        <w:tc>
-          <w:tcPr>
-            <w:tcW w:type="dxa" w:w="960"/>
-          </w:tcPr>
-          <w:p>
-            <w:r>
-              <w:t>02 EA</w:t>
-            </w:r>
-          </w:p>
-        </w:tc>
-        <w:tc>
-          <w:tcPr>
-            <w:tcW w:type="dxa" w:w="960"/>
-          </w:tcPr>
-          <w:p>
-            <w:r>
-              <w:t>17498790</w:t>
-            </w:r>
-          </w:p>
-        </w:tc>
-        <w:tc>
-          <w:tcPr>
-            <w:tcW w:type="dxa" w:w="960"/>
-          </w:tcPr>
-          <w:p>
-            <w:r>
-              <w:t>Atender demanda do 2721 durante inspeção e aproveitamento de missão CAN.</w:t>
-            </w:r>
-          </w:p>
-        </w:tc>
-        <w:tc>
-          <w:tcPr>
-            <w:tcW w:type="dxa" w:w="960"/>
-          </w:tcPr>
-          <w:p>
-            <w:r>
-              <w:t>2721</w:t>
-            </w:r>
-          </w:p>
-        </w:tc>
-        <w:tc>
-          <w:tcPr>
-            <w:tcW w:type="dxa" w:w="960"/>
-          </w:tcPr>
-          <w:p>
-            <w:r>
-              <w:t>BABR</w:t>
-            </w:r>
-          </w:p>
-        </w:tc>
-        <w:tc>
-          <w:tcPr>
-            <w:tcW w:type="dxa" w:w="960"/>
-          </w:tcPr>
-          <w:p>
-            <w:r>
-              <w:t>Pendente</w:t>
-            </w:r>
-          </w:p>
-        </w:tc>
-      </w:tr>
-      <w:tr>
-        <w:tc>
-          <w:tcPr>
-            <w:tcW w:type="dxa" w:w="960"/>
-          </w:tcPr>
-          <w:p>
-            <w:r>
-              <w:t>272</w:t>
-            </w:r>
-          </w:p>
-        </w:tc>
-        <w:tc>
-          <w:tcPr>
-            <w:tcW w:type="dxa" w:w="960"/>
-          </w:tcPr>
-          <w:p>
-            <w:r>
-              <w:t>9910573-21</w:t>
-            </w:r>
-          </w:p>
-        </w:tc>
-        <w:tc>
-          <w:tcPr>
-            <w:tcW w:type="dxa" w:w="960"/>
-          </w:tcPr>
-          <w:p>
-            <w:r>
-              <w:t>PARTITION ASSY-CARGO AFT</w:t>
-            </w:r>
-          </w:p>
-        </w:tc>
-        <w:tc>
-          <w:tcPr>
-            <w:tcW w:type="dxa" w:w="960"/>
-          </w:tcPr>
-          <w:p>
-            <w:r>
-              <w:t>01 EA</w:t>
-            </w:r>
-          </w:p>
-        </w:tc>
-        <w:tc>
-          <w:tcPr>
-            <w:tcW w:type="dxa" w:w="960"/>
-          </w:tcPr>
-          <w:p>
-            <w:r>
-              <w:t>17433696</w:t>
-            </w:r>
-          </w:p>
-        </w:tc>
-        <w:tc>
-          <w:tcPr>
-            <w:tcW w:type="dxa" w:w="960"/>
-          </w:tcPr>
-          <w:p>
-            <w:r>
-              <w:t>Atender demanda do 2721 durante inspeção e aproveitamento de missão CAN.</w:t>
-            </w:r>
-          </w:p>
-        </w:tc>
-        <w:tc>
-          <w:tcPr>
-            <w:tcW w:type="dxa" w:w="960"/>
-          </w:tcPr>
-          <w:p>
-            <w:r>
-              <w:t>2721</w:t>
-            </w:r>
-          </w:p>
-        </w:tc>
-        <w:tc>
-          <w:tcPr>
-            <w:tcW w:type="dxa" w:w="960"/>
-          </w:tcPr>
-          <w:p>
-            <w:r>
-              <w:t>BABR</w:t>
-            </w:r>
-          </w:p>
-        </w:tc>
-        <w:tc>
-          <w:tcPr>
-            <w:tcW w:type="dxa" w:w="960"/>
-          </w:tcPr>
-          <w:p>
-            <w:r>
-              <w:t>Pendente</w:t>
-            </w:r>
-          </w:p>
-        </w:tc>
-      </w:tr>
-      <w:tr>
-        <w:tc>
-          <w:tcPr>
-            <w:tcW w:type="dxa" w:w="960"/>
-          </w:tcPr>
-          <w:p>
-            <w:r>
-              <w:t>273</w:t>
-            </w:r>
-          </w:p>
-        </w:tc>
-        <w:tc>
-          <w:tcPr>
-            <w:tcW w:type="dxa" w:w="960"/>
-          </w:tcPr>
-          <w:p>
-            <w:r>
-              <w:t>3121248-03</w:t>
-            </w:r>
-          </w:p>
-        </w:tc>
-        <w:tc>
-          <w:tcPr>
-            <w:tcW w:type="dxa" w:w="960"/>
-          </w:tcPr>
-          <w:p>
-            <w:r>
-              <w:t>VALVE ASSEMBLY,COMPRESSOR BLEED</w:t>
-            </w:r>
-          </w:p>
-        </w:tc>
-        <w:tc>
-          <w:tcPr>
-            <w:tcW w:type="dxa" w:w="960"/>
-          </w:tcPr>
-          <w:p>
-            <w:r>
-              <w:t>01 EA</w:t>
-            </w:r>
-          </w:p>
-        </w:tc>
-        <w:tc>
-          <w:tcPr>
-            <w:tcW w:type="dxa" w:w="960"/>
-          </w:tcPr>
-          <w:p>
-            <w:r>
-              <w:t>17588337</w:t>
-            </w:r>
-          </w:p>
-        </w:tc>
-        <w:tc>
-          <w:tcPr>
-            <w:tcW w:type="dxa" w:w="960"/>
-          </w:tcPr>
-          <w:p>
-            <w:r>
-              <w:t>Atender demanda do 2721 durante inspeção e aproveitamento de missão CAN.</w:t>
-            </w:r>
-          </w:p>
-        </w:tc>
-        <w:tc>
-          <w:tcPr>
-            <w:tcW w:type="dxa" w:w="960"/>
-          </w:tcPr>
-          <w:p>
-            <w:r>
-              <w:t>2721</w:t>
-            </w:r>
-          </w:p>
-        </w:tc>
-        <w:tc>
-          <w:tcPr>
-            <w:tcW w:type="dxa" w:w="960"/>
-          </w:tcPr>
-          <w:p>
-            <w:r>
-              <w:t>BABR</w:t>
-            </w:r>
-          </w:p>
-        </w:tc>
-        <w:tc>
-          <w:tcPr>
-            <w:tcW w:type="dxa" w:w="960"/>
-          </w:tcPr>
-          <w:p>
-            <w:r>
-              <w:t>Pendente</w:t>
-            </w:r>
-          </w:p>
-        </w:tc>
-      </w:tr>
-      <w:tr>
-        <w:tc>
-          <w:tcPr>
-            <w:tcW w:type="dxa" w:w="960"/>
-          </w:tcPr>
-          <w:p>
-            <w:r>
-              <w:t>274</w:t>
-            </w:r>
-          </w:p>
-        </w:tc>
-        <w:tc>
-          <w:tcPr>
-            <w:tcW w:type="dxa" w:w="960"/>
-          </w:tcPr>
-          <w:p>
-            <w:r>
-              <w:t>5040033933</w:t>
-            </w:r>
-          </w:p>
-        </w:tc>
-        <w:tc>
-          <w:tcPr>
-            <w:tcW w:type="dxa" w:w="960"/>
-          </w:tcPr>
-          <w:p>
-            <w:r>
-              <w:t>GYRO HORIZON</w:t>
-            </w:r>
-          </w:p>
-        </w:tc>
-        <w:tc>
-          <w:tcPr>
-            <w:tcW w:type="dxa" w:w="960"/>
-          </w:tcPr>
-          <w:p>
-            <w:r>
-              <w:t>01 EA</w:t>
-            </w:r>
-          </w:p>
-        </w:tc>
-        <w:tc>
-          <w:tcPr>
-            <w:tcW w:type="dxa" w:w="960"/>
-          </w:tcPr>
-          <w:p>
-            <w:r>
-              <w:t>17601235</w:t>
-            </w:r>
-          </w:p>
-        </w:tc>
-        <w:tc>
-          <w:tcPr>
-            <w:tcW w:type="dxa" w:w="960"/>
-          </w:tcPr>
-          <w:p>
-            <w:r>
-              <w:t>Atender demanda do 2709 durante inspeção.</w:t>
-            </w:r>
-          </w:p>
-        </w:tc>
-        <w:tc>
-          <w:tcPr>
-            <w:tcW w:type="dxa" w:w="960"/>
-          </w:tcPr>
-          <w:p>
-            <w:r>
-              <w:t>2709</w:t>
-            </w:r>
-          </w:p>
-        </w:tc>
-        <w:tc>
-          <w:tcPr>
-            <w:tcW w:type="dxa" w:w="960"/>
-          </w:tcPr>
-          <w:p>
-            <w:r>
-              <w:t>BABR</w:t>
-            </w:r>
-          </w:p>
-        </w:tc>
-        <w:tc>
-          <w:tcPr>
-            <w:tcW w:type="dxa" w:w="960"/>
-          </w:tcPr>
-          <w:p>
-            <w:r>
-              <w:t>Pendente</w:t>
-            </w:r>
-          </w:p>
-        </w:tc>
-      </w:tr>
-      <w:tr>
-        <w:tc>
-          <w:tcPr>
-            <w:tcW w:type="dxa" w:w="960"/>
-          </w:tcPr>
-          <w:p>
-            <w:r>
-              <w:t>275</w:t>
-            </w:r>
-          </w:p>
-        </w:tc>
-        <w:tc>
-          <w:tcPr>
-            <w:tcW w:type="dxa" w:w="960"/>
-          </w:tcPr>
-          <w:p>
-            <w:r>
-              <w:t>R581559</w:t>
-            </w:r>
-          </w:p>
-        </w:tc>
-        <w:tc>
-          <w:tcPr>
-            <w:tcW w:type="dxa" w:w="960"/>
-          </w:tcPr>
-          <w:p>
-            <w:r>
-              <w:t>SEAL,DOOR EMERGENCY EXIT</w:t>
-            </w:r>
-          </w:p>
-        </w:tc>
-        <w:tc>
-          <w:tcPr>
-            <w:tcW w:type="dxa" w:w="960"/>
-          </w:tcPr>
-          <w:p>
-            <w:r>
-              <w:t>04 FT</w:t>
-            </w:r>
-          </w:p>
-        </w:tc>
-        <w:tc>
-          <w:tcPr>
-            <w:tcW w:type="dxa" w:w="960"/>
-          </w:tcPr>
-          <w:p>
-            <w:r>
-              <w:t>17459952</w:t>
-            </w:r>
-          </w:p>
-        </w:tc>
-        <w:tc>
-          <w:tcPr>
-            <w:tcW w:type="dxa" w:w="960"/>
-          </w:tcPr>
-          <w:p>
-            <w:r>
-              <w:t>Atender demanda do 2709 durante inspeção.</w:t>
-            </w:r>
-          </w:p>
-        </w:tc>
-        <w:tc>
-          <w:tcPr>
-            <w:tcW w:type="dxa" w:w="960"/>
-          </w:tcPr>
-          <w:p>
-            <w:r>
-              <w:t>2709</w:t>
-            </w:r>
-          </w:p>
-        </w:tc>
-        <w:tc>
-          <w:tcPr>
-            <w:tcW w:type="dxa" w:w="960"/>
-          </w:tcPr>
-          <w:p>
-            <w:r>
-              <w:t>BABR</w:t>
-            </w:r>
-          </w:p>
-        </w:tc>
-        <w:tc>
-          <w:tcPr>
-            <w:tcW w:type="dxa" w:w="960"/>
-          </w:tcPr>
-          <w:p>
-            <w:r>
-              <w:t>Pendente</w:t>
-            </w:r>
-          </w:p>
-        </w:tc>
-      </w:tr>
-      <w:tr>
-        <w:tc>
-          <w:tcPr>
-            <w:tcW w:type="dxa" w:w="960"/>
-          </w:tcPr>
-          <w:p>
-            <w:r>
-              <w:t>276</w:t>
-            </w:r>
-          </w:p>
-        </w:tc>
-        <w:tc>
-          <w:tcPr>
-            <w:tcW w:type="dxa" w:w="960"/>
-          </w:tcPr>
-          <w:p>
-            <w:r>
-              <w:t>S3413-104</w:t>
-            </w:r>
-          </w:p>
-        </w:tc>
-        <w:tc>
-          <w:tcPr>
-            <w:tcW w:type="dxa" w:w="960"/>
-          </w:tcPr>
-          <w:p>
-            <w:r>
-              <w:t>STUD</w:t>
-            </w:r>
-          </w:p>
-        </w:tc>
-        <w:tc>
-          <w:tcPr>
-            <w:tcW w:type="dxa" w:w="960"/>
-          </w:tcPr>
-          <w:p>
-            <w:r>
-              <w:t>10 EA</w:t>
-            </w:r>
-          </w:p>
-        </w:tc>
-        <w:tc>
-          <w:tcPr>
-            <w:tcW w:type="dxa" w:w="960"/>
-          </w:tcPr>
-          <w:p>
-            <w:r>
-              <w:t>17601337</w:t>
-            </w:r>
-          </w:p>
-        </w:tc>
-        <w:tc>
-          <w:tcPr>
-            <w:tcW w:type="dxa" w:w="960"/>
-          </w:tcPr>
-          <w:p>
-            <w:r>
-              <w:t>Atender demanda do 2709 durante inspeção.</w:t>
-            </w:r>
-          </w:p>
-        </w:tc>
-        <w:tc>
-          <w:tcPr>
-            <w:tcW w:type="dxa" w:w="960"/>
-          </w:tcPr>
-          <w:p>
-            <w:r>
-              <w:t>2709</w:t>
-            </w:r>
-          </w:p>
-        </w:tc>
-        <w:tc>
-          <w:tcPr>
-            <w:tcW w:type="dxa" w:w="960"/>
-          </w:tcPr>
-          <w:p>
-            <w:r>
-              <w:t>BABR</w:t>
-            </w:r>
-          </w:p>
-        </w:tc>
-        <w:tc>
-          <w:tcPr>
-            <w:tcW w:type="dxa" w:w="960"/>
-          </w:tcPr>
-          <w:p>
-            <w:r>
-              <w:t>Pendente</w:t>
-            </w:r>
-          </w:p>
-        </w:tc>
-      </w:tr>
-      <w:tr>
-        <w:tc>
-          <w:tcPr>
-            <w:tcW w:type="dxa" w:w="960"/>
-          </w:tcPr>
-          <w:p>
-            <w:r>
-              <w:t>277</w:t>
-            </w:r>
-          </w:p>
-        </w:tc>
-        <w:tc>
-          <w:tcPr>
-            <w:tcW w:type="dxa" w:w="960"/>
-          </w:tcPr>
-          <w:p>
-            <w:r>
-              <w:t>S3413-105</w:t>
-            </w:r>
-          </w:p>
-        </w:tc>
-        <w:tc>
-          <w:tcPr>
-            <w:tcW w:type="dxa" w:w="960"/>
-          </w:tcPr>
-          <w:p>
-            <w:r>
-              <w:t>STUD</w:t>
-            </w:r>
-          </w:p>
-        </w:tc>
-        <w:tc>
-          <w:tcPr>
-            <w:tcW w:type="dxa" w:w="960"/>
-          </w:tcPr>
-          <w:p>
-            <w:r>
-              <w:t>10 EA</w:t>
-            </w:r>
-          </w:p>
-        </w:tc>
-        <w:tc>
-          <w:tcPr>
-            <w:tcW w:type="dxa" w:w="960"/>
-          </w:tcPr>
-          <w:p>
-            <w:r>
-              <w:t>17601448</w:t>
-            </w:r>
-          </w:p>
-        </w:tc>
-        <w:tc>
-          <w:tcPr>
-            <w:tcW w:type="dxa" w:w="960"/>
-          </w:tcPr>
-          <w:p>
-            <w:r>
-              <w:t>Atender demanda do 2709 durante inspeção.</w:t>
-            </w:r>
-          </w:p>
-        </w:tc>
-        <w:tc>
-          <w:tcPr>
-            <w:tcW w:type="dxa" w:w="960"/>
-          </w:tcPr>
-          <w:p>
-            <w:r>
-              <w:t>2709</w:t>
-            </w:r>
-          </w:p>
-        </w:tc>
-        <w:tc>
-          <w:tcPr>
-            <w:tcW w:type="dxa" w:w="960"/>
-          </w:tcPr>
-          <w:p>
-            <w:r>
-              <w:t>BABR</w:t>
-            </w:r>
-          </w:p>
-        </w:tc>
-        <w:tc>
-          <w:tcPr>
-            <w:tcW w:type="dxa" w:w="960"/>
-          </w:tcPr>
-          <w:p>
-            <w:r>
-              <w:t>Pendente</w:t>
-            </w:r>
-          </w:p>
-        </w:tc>
-      </w:tr>
-      <w:tr>
-        <w:tc>
-          <w:tcPr>
-            <w:tcW w:type="dxa" w:w="960"/>
-          </w:tcPr>
-          <w:p>
-            <w:r>
-              <w:t>278</w:t>
-            </w:r>
-          </w:p>
-        </w:tc>
-        <w:tc>
-          <w:tcPr>
-            <w:tcW w:type="dxa" w:w="960"/>
-          </w:tcPr>
-          <w:p>
-            <w:r>
-              <w:t>S3413-107</w:t>
-            </w:r>
-          </w:p>
-        </w:tc>
-        <w:tc>
-          <w:tcPr>
-            <w:tcW w:type="dxa" w:w="960"/>
-          </w:tcPr>
-          <w:p>
-            <w:r>
-              <w:t>STUD</w:t>
-            </w:r>
-          </w:p>
-        </w:tc>
-        <w:tc>
-          <w:tcPr>
-            <w:tcW w:type="dxa" w:w="960"/>
-          </w:tcPr>
-          <w:p>
-            <w:r>
-              <w:t>10 EA</w:t>
-            </w:r>
-          </w:p>
-        </w:tc>
-        <w:tc>
-          <w:tcPr>
-            <w:tcW w:type="dxa" w:w="960"/>
-          </w:tcPr>
-          <w:p>
-            <w:r>
-              <w:t>17601489</w:t>
-            </w:r>
-          </w:p>
-        </w:tc>
-        <w:tc>
-          <w:tcPr>
-            <w:tcW w:type="dxa" w:w="960"/>
-          </w:tcPr>
-          <w:p>
-            <w:r>
-              <w:t>Atender demanda do 2709 durante inspeção.</w:t>
-            </w:r>
-          </w:p>
-        </w:tc>
-        <w:tc>
-          <w:tcPr>
-            <w:tcW w:type="dxa" w:w="960"/>
-          </w:tcPr>
-          <w:p>
-            <w:r>
-              <w:t>2709</w:t>
-            </w:r>
-          </w:p>
-        </w:tc>
-        <w:tc>
-          <w:tcPr>
-            <w:tcW w:type="dxa" w:w="960"/>
-          </w:tcPr>
-          <w:p>
-            <w:r>
-              <w:t>BABR</w:t>
-            </w:r>
-          </w:p>
-        </w:tc>
-        <w:tc>
-          <w:tcPr>
-            <w:tcW w:type="dxa" w:w="960"/>
-          </w:tcPr>
-          <w:p>
-            <w:r>
-              <w:t>Pendente</w:t>
-            </w:r>
-          </w:p>
-        </w:tc>
-      </w:tr>
-      <w:tr>
-        <w:tc>
-          <w:tcPr>
-            <w:tcW w:type="dxa" w:w="960"/>
-          </w:tcPr>
-          <w:p>
-            <w:r>
-              <w:t>279</w:t>
-            </w:r>
-          </w:p>
-        </w:tc>
-        <w:tc>
-          <w:tcPr>
-            <w:tcW w:type="dxa" w:w="960"/>
-          </w:tcPr>
-          <w:p>
-            <w:r>
-              <w:t>S3413-109</w:t>
-            </w:r>
-          </w:p>
-        </w:tc>
-        <w:tc>
-          <w:tcPr>
-            <w:tcW w:type="dxa" w:w="960"/>
-          </w:tcPr>
-          <w:p>
-            <w:r>
-              <w:t>STUD</w:t>
-            </w:r>
-          </w:p>
-        </w:tc>
-        <w:tc>
-          <w:tcPr>
-            <w:tcW w:type="dxa" w:w="960"/>
-          </w:tcPr>
-          <w:p>
-            <w:r>
-              <w:t>05 EA</w:t>
-            </w:r>
-          </w:p>
-        </w:tc>
-        <w:tc>
-          <w:tcPr>
-            <w:tcW w:type="dxa" w:w="960"/>
-          </w:tcPr>
-          <w:p>
-            <w:r>
-              <w:t>17601565</w:t>
-            </w:r>
-          </w:p>
-        </w:tc>
-        <w:tc>
-          <w:tcPr>
-            <w:tcW w:type="dxa" w:w="960"/>
-          </w:tcPr>
-          <w:p>
-            <w:r>
-              <w:t>Atender demanda do 2709 durante inspeção.</w:t>
-            </w:r>
-          </w:p>
-        </w:tc>
-        <w:tc>
-          <w:tcPr>
-            <w:tcW w:type="dxa" w:w="960"/>
-          </w:tcPr>
-          <w:p>
-            <w:r>
-              <w:t>2709</w:t>
-            </w:r>
-          </w:p>
-        </w:tc>
-        <w:tc>
-          <w:tcPr>
-            <w:tcW w:type="dxa" w:w="960"/>
-          </w:tcPr>
-          <w:p>
-            <w:r>
-              <w:t>BABR</w:t>
-            </w:r>
-          </w:p>
-        </w:tc>
-        <w:tc>
-          <w:tcPr>
-            <w:tcW w:type="dxa" w:w="960"/>
-          </w:tcPr>
-          <w:p>
-            <w:r>
-              <w:t>Pendente</w:t>
-            </w:r>
-          </w:p>
-        </w:tc>
-      </w:tr>
-      <w:tr>
-        <w:tc>
-          <w:tcPr>
-            <w:tcW w:type="dxa" w:w="960"/>
-          </w:tcPr>
-          <w:p>
-            <w:r>
-              <w:t>280</w:t>
-            </w:r>
-          </w:p>
-        </w:tc>
-        <w:tc>
-          <w:tcPr>
-            <w:tcW w:type="dxa" w:w="960"/>
-          </w:tcPr>
-          <w:p>
-            <w:r>
-              <w:t>S3413-110</w:t>
-            </w:r>
-          </w:p>
-        </w:tc>
-        <w:tc>
-          <w:tcPr>
-            <w:tcW w:type="dxa" w:w="960"/>
-          </w:tcPr>
-          <w:p>
-            <w:r>
-              <w:t>STUD</w:t>
-            </w:r>
-          </w:p>
-        </w:tc>
-        <w:tc>
-          <w:tcPr>
-            <w:tcW w:type="dxa" w:w="960"/>
-          </w:tcPr>
-          <w:p>
-            <w:r>
-              <w:t>10 EA</w:t>
-            </w:r>
-          </w:p>
-        </w:tc>
-        <w:tc>
-          <w:tcPr>
-            <w:tcW w:type="dxa" w:w="960"/>
-          </w:tcPr>
-          <w:p>
-            <w:r>
-              <w:t>17601700</w:t>
-            </w:r>
-          </w:p>
-        </w:tc>
-        <w:tc>
-          <w:tcPr>
-            <w:tcW w:type="dxa" w:w="960"/>
-          </w:tcPr>
-          <w:p>
-            <w:r>
-              <w:t>Atender demanda do 2709 durante inspeção.</w:t>
-            </w:r>
-          </w:p>
-        </w:tc>
-        <w:tc>
-          <w:tcPr>
-            <w:tcW w:type="dxa" w:w="960"/>
-          </w:tcPr>
-          <w:p>
-            <w:r>
-              <w:t>2709</w:t>
-            </w:r>
-          </w:p>
-        </w:tc>
-        <w:tc>
-          <w:tcPr>
-            <w:tcW w:type="dxa" w:w="960"/>
-          </w:tcPr>
-          <w:p>
-            <w:r>
-              <w:t>BABR</w:t>
-            </w:r>
-          </w:p>
-        </w:tc>
-        <w:tc>
-          <w:tcPr>
-            <w:tcW w:type="dxa" w:w="960"/>
-          </w:tcPr>
-          <w:p>
-            <w:r>
-              <w:t>Pendente</w:t>
-            </w:r>
-          </w:p>
-        </w:tc>
-      </w:tr>
-      <w:tr>
-        <w:tc>
-          <w:tcPr>
-            <w:tcW w:type="dxa" w:w="960"/>
-          </w:tcPr>
-          <w:p>
-            <w:r>
-              <w:t>281</w:t>
-            </w:r>
-          </w:p>
-        </w:tc>
-        <w:tc>
-          <w:tcPr>
-            <w:tcW w:type="dxa" w:w="960"/>
-          </w:tcPr>
-          <w:p>
-            <w:r>
-              <w:t>S2319-64</w:t>
-            </w:r>
-          </w:p>
-        </w:tc>
-        <w:tc>
-          <w:tcPr>
-            <w:tcW w:type="dxa" w:w="960"/>
-          </w:tcPr>
-          <w:p>
-            <w:r>
-              <w:t>GROMMET</w:t>
-            </w:r>
-          </w:p>
-        </w:tc>
-        <w:tc>
-          <w:tcPr>
-            <w:tcW w:type="dxa" w:w="960"/>
-          </w:tcPr>
-          <w:p>
-            <w:r>
-              <w:t>50 EA</w:t>
-            </w:r>
-          </w:p>
-        </w:tc>
-        <w:tc>
-          <w:tcPr>
-            <w:tcW w:type="dxa" w:w="960"/>
-          </w:tcPr>
-          <w:p>
-            <w:r>
-              <w:t>17601696</w:t>
-            </w:r>
-          </w:p>
-        </w:tc>
-        <w:tc>
-          <w:tcPr>
-            <w:tcW w:type="dxa" w:w="960"/>
-          </w:tcPr>
-          <w:p>
-            <w:r>
-              <w:t>Atender demanda do 2709 durante inspeção.</w:t>
-            </w:r>
-          </w:p>
-        </w:tc>
-        <w:tc>
-          <w:tcPr>
-            <w:tcW w:type="dxa" w:w="960"/>
-          </w:tcPr>
-          <w:p>
-            <w:r>
-              <w:t>2709</w:t>
-            </w:r>
-          </w:p>
-        </w:tc>
-        <w:tc>
-          <w:tcPr>
-            <w:tcW w:type="dxa" w:w="960"/>
-          </w:tcPr>
-          <w:p>
-            <w:r>
-              <w:t>BABR</w:t>
-            </w:r>
-          </w:p>
-        </w:tc>
-        <w:tc>
-          <w:tcPr>
-            <w:tcW w:type="dxa" w:w="960"/>
-          </w:tcPr>
-          <w:p>
-            <w:r>
-              <w:t>Pendente</w:t>
-            </w:r>
-          </w:p>
-        </w:tc>
-      </w:tr>
-      <w:tr>
-        <w:tc>
-          <w:tcPr>
-            <w:tcW w:type="dxa" w:w="960"/>
-          </w:tcPr>
-          <w:p>
-            <w:r>
-              <w:t>282</w:t>
-            </w:r>
-          </w:p>
-        </w:tc>
-        <w:tc>
-          <w:tcPr>
-            <w:tcW w:type="dxa" w:w="960"/>
-          </w:tcPr>
-          <w:p>
-            <w:r>
-              <w:t>S2319-50</w:t>
-            </w:r>
-          </w:p>
-        </w:tc>
-        <w:tc>
-          <w:tcPr>
-            <w:tcW w:type="dxa" w:w="960"/>
-          </w:tcPr>
-          <w:p>
-            <w:r>
-              <w:t>RECEPTACLE,TURNLOCK FASTENER</w:t>
-            </w:r>
-          </w:p>
-        </w:tc>
-        <w:tc>
-          <w:tcPr>
-            <w:tcW w:type="dxa" w:w="960"/>
-          </w:tcPr>
-          <w:p>
-            <w:r>
-              <w:t>50 EA</w:t>
-            </w:r>
-          </w:p>
-        </w:tc>
-        <w:tc>
-          <w:tcPr>
-            <w:tcW w:type="dxa" w:w="960"/>
-          </w:tcPr>
-          <w:p>
-            <w:r>
-              <w:t>17602036</w:t>
-            </w:r>
-          </w:p>
-        </w:tc>
-        <w:tc>
-          <w:tcPr>
-            <w:tcW w:type="dxa" w:w="960"/>
-          </w:tcPr>
-          <w:p>
-            <w:r>
-              <w:t>Atender demanda do 2709 durante inspeção.</w:t>
-            </w:r>
-          </w:p>
-        </w:tc>
-        <w:tc>
-          <w:tcPr>
-            <w:tcW w:type="dxa" w:w="960"/>
-          </w:tcPr>
-          <w:p>
-            <w:r>
-              <w:t>2709</w:t>
-            </w:r>
-          </w:p>
-        </w:tc>
-        <w:tc>
-          <w:tcPr>
-            <w:tcW w:type="dxa" w:w="960"/>
-          </w:tcPr>
-          <w:p>
-            <w:r>
-              <w:t>BABR</w:t>
-            </w:r>
-          </w:p>
-        </w:tc>
-        <w:tc>
-          <w:tcPr>
-            <w:tcW w:type="dxa" w:w="960"/>
-          </w:tcPr>
-          <w:p>
-            <w:r>
-              <w:t>Pendente</w:t>
-            </w:r>
-          </w:p>
-        </w:tc>
-      </w:tr>
-      <w:tr>
-        <w:tc>
-          <w:tcPr>
-            <w:tcW w:type="dxa" w:w="960"/>
-          </w:tcPr>
-          <w:p>
-            <w:r>
-              <w:t>283</w:t>
-            </w:r>
-          </w:p>
-        </w:tc>
-        <w:tc>
-          <w:tcPr>
-            <w:tcW w:type="dxa" w:w="960"/>
-          </w:tcPr>
-          <w:p>
-            <w:r>
-              <w:t>B4864</w:t>
-            </w:r>
-          </w:p>
-        </w:tc>
-        <w:tc>
-          <w:tcPr>
-            <w:tcW w:type="dxa" w:w="960"/>
-          </w:tcPr>
-          <w:p>
-            <w:r>
-              <w:t>SUPPORT SPINNER</w:t>
-            </w:r>
-          </w:p>
-        </w:tc>
-        <w:tc>
-          <w:tcPr>
-            <w:tcW w:type="dxa" w:w="960"/>
-          </w:tcPr>
-          <w:p>
-            <w:r>
-              <w:t>01 EA</w:t>
-            </w:r>
-          </w:p>
-        </w:tc>
-        <w:tc>
-          <w:tcPr>
-            <w:tcW w:type="dxa" w:w="960"/>
-          </w:tcPr>
-          <w:p>
-            <w:r>
-              <w:t>17603271</w:t>
-            </w:r>
-          </w:p>
-        </w:tc>
-        <w:tc>
-          <w:tcPr>
-            <w:tcW w:type="dxa" w:w="960"/>
-          </w:tcPr>
-          <w:p>
-            <w:r>
-              <w:t>Atender demanda do 2709 durante inspeção.</w:t>
-            </w:r>
-          </w:p>
-        </w:tc>
-        <w:tc>
-          <w:tcPr>
-            <w:tcW w:type="dxa" w:w="960"/>
-          </w:tcPr>
-          <w:p>
-            <w:r>
-              <w:t>2709</w:t>
-            </w:r>
-          </w:p>
-        </w:tc>
-        <w:tc>
-          <w:tcPr>
-            <w:tcW w:type="dxa" w:w="960"/>
-          </w:tcPr>
-          <w:p>
-            <w:r>
-              <w:t>BABR</w:t>
-            </w:r>
-          </w:p>
-        </w:tc>
-        <w:tc>
-          <w:tcPr>
-            <w:tcW w:type="dxa" w:w="960"/>
-          </w:tcPr>
-          <w:p>
-            <w:r>
-              <w:t>Pendente</w:t>
-            </w:r>
-          </w:p>
-        </w:tc>
-      </w:tr>
-      <w:tr>
-        <w:tc>
-          <w:tcPr>
-            <w:tcW w:type="dxa" w:w="960"/>
-          </w:tcPr>
-          <w:p>
-            <w:r>
-              <w:t>284</w:t>
-            </w:r>
-          </w:p>
-        </w:tc>
-        <w:tc>
-          <w:tcPr>
-            <w:tcW w:type="dxa" w:w="960"/>
-          </w:tcPr>
-          <w:p>
-            <w:r>
-              <w:t>B4940-1</w:t>
-            </w:r>
-          </w:p>
-        </w:tc>
-        <w:tc>
-          <w:tcPr>
-            <w:tcW w:type="dxa" w:w="960"/>
-          </w:tcPr>
-          <w:p>
-            <w:r>
-              <w:t>SHIM</w:t>
-            </w:r>
-          </w:p>
-        </w:tc>
-        <w:tc>
-          <w:tcPr>
-            <w:tcW w:type="dxa" w:w="960"/>
-          </w:tcPr>
-          <w:p>
-            <w:r>
-              <w:t>01 EA</w:t>
-            </w:r>
-          </w:p>
-        </w:tc>
-        <w:tc>
-          <w:tcPr>
-            <w:tcW w:type="dxa" w:w="960"/>
-          </w:tcPr>
-          <w:p>
-            <w:r>
-              <w:t>17603023</w:t>
-            </w:r>
-          </w:p>
-        </w:tc>
-        <w:tc>
-          <w:tcPr>
-            <w:tcW w:type="dxa" w:w="960"/>
-          </w:tcPr>
-          <w:p>
-            <w:r>
-              <w:t>Atender demanda do 2709 durante inspeção.</w:t>
-            </w:r>
-          </w:p>
-        </w:tc>
-        <w:tc>
-          <w:tcPr>
-            <w:tcW w:type="dxa" w:w="960"/>
-          </w:tcPr>
-          <w:p>
-            <w:r>
-              <w:t>2709</w:t>
-            </w:r>
-          </w:p>
-        </w:tc>
-        <w:tc>
-          <w:tcPr>
-            <w:tcW w:type="dxa" w:w="960"/>
-          </w:tcPr>
-          <w:p>
-            <w:r>
-              <w:t>BABR</w:t>
-            </w:r>
-          </w:p>
-        </w:tc>
-        <w:tc>
-          <w:tcPr>
-            <w:tcW w:type="dxa" w:w="960"/>
-          </w:tcPr>
-          <w:p>
-            <w:r>
-              <w:t>Pendente</w:t>
-            </w:r>
-          </w:p>
-        </w:tc>
-      </w:tr>
-      <w:tr>
-        <w:tc>
-          <w:tcPr>
-            <w:tcW w:type="dxa" w:w="960"/>
-          </w:tcPr>
-          <w:p>
-            <w:r>
-              <w:t>285</w:t>
-            </w:r>
-          </w:p>
-        </w:tc>
-        <w:tc>
-          <w:tcPr>
-            <w:tcW w:type="dxa" w:w="960"/>
-          </w:tcPr>
-          <w:p>
-            <w:r>
-              <w:t>B4940-2</w:t>
-            </w:r>
-          </w:p>
-        </w:tc>
-        <w:tc>
-          <w:tcPr>
-            <w:tcW w:type="dxa" w:w="960"/>
-          </w:tcPr>
-          <w:p>
-            <w:r>
-              <w:t>SHIM</w:t>
-            </w:r>
-          </w:p>
-        </w:tc>
-        <w:tc>
-          <w:tcPr>
-            <w:tcW w:type="dxa" w:w="960"/>
-          </w:tcPr>
-          <w:p>
-            <w:r>
-              <w:t>10 EA</w:t>
-            </w:r>
-          </w:p>
-        </w:tc>
-        <w:tc>
-          <w:tcPr>
-            <w:tcW w:type="dxa" w:w="960"/>
-          </w:tcPr>
-          <w:p>
-            <w:r>
-              <w:t>17603189</w:t>
-            </w:r>
-          </w:p>
-        </w:tc>
-        <w:tc>
-          <w:tcPr>
-            <w:tcW w:type="dxa" w:w="960"/>
-          </w:tcPr>
-          <w:p>
-            <w:r>
-              <w:t>Atender demanda do 2709 durante inspeção.</w:t>
-            </w:r>
-          </w:p>
-        </w:tc>
-        <w:tc>
-          <w:tcPr>
-            <w:tcW w:type="dxa" w:w="960"/>
-          </w:tcPr>
-          <w:p>
-            <w:r>
-              <w:t>2709</w:t>
-            </w:r>
-          </w:p>
-        </w:tc>
-        <w:tc>
-          <w:tcPr>
-            <w:tcW w:type="dxa" w:w="960"/>
-          </w:tcPr>
-          <w:p>
-            <w:r>
-              <w:t>BABR</w:t>
-            </w:r>
-          </w:p>
-        </w:tc>
-        <w:tc>
-          <w:tcPr>
-            <w:tcW w:type="dxa" w:w="960"/>
-          </w:tcPr>
-          <w:p>
-            <w:r>
-              <w:t>Pendente</w:t>
-            </w:r>
-          </w:p>
-        </w:tc>
-      </w:tr>
-      <w:tr>
-        <w:tc>
-          <w:tcPr>
-            <w:tcW w:type="dxa" w:w="960"/>
-          </w:tcPr>
-          <w:p>
-            <w:r>
-              <w:t>286</w:t>
-            </w:r>
-          </w:p>
-        </w:tc>
-        <w:tc>
-          <w:tcPr>
-            <w:tcW w:type="dxa" w:w="960"/>
-          </w:tcPr>
-          <w:p>
-            <w:r>
-              <w:t>2654012-2</w:t>
-            </w:r>
-          </w:p>
-        </w:tc>
-        <w:tc>
-          <w:tcPr>
-            <w:tcW w:type="dxa" w:w="960"/>
-          </w:tcPr>
-          <w:p>
-            <w:r>
-              <w:t>CLAMP</w:t>
-            </w:r>
-          </w:p>
-        </w:tc>
-        <w:tc>
-          <w:tcPr>
-            <w:tcW w:type="dxa" w:w="960"/>
-          </w:tcPr>
-          <w:p>
-            <w:r>
-              <w:t>01 EA</w:t>
-            </w:r>
-          </w:p>
-        </w:tc>
-        <w:tc>
-          <w:tcPr>
-            <w:tcW w:type="dxa" w:w="960"/>
-          </w:tcPr>
-          <w:p>
-            <w:r>
-              <w:t>17603009</w:t>
-            </w:r>
-          </w:p>
-        </w:tc>
-        <w:tc>
-          <w:tcPr>
-            <w:tcW w:type="dxa" w:w="960"/>
-          </w:tcPr>
-          <w:p>
-            <w:r>
-              <w:t>Atender demanda do 2709 durante inspeção.</w:t>
-            </w:r>
-          </w:p>
-        </w:tc>
-        <w:tc>
-          <w:tcPr>
-            <w:tcW w:type="dxa" w:w="960"/>
-          </w:tcPr>
-          <w:p>
-            <w:r>
-              <w:t>2709</w:t>
-            </w:r>
-          </w:p>
-        </w:tc>
-        <w:tc>
-          <w:tcPr>
-            <w:tcW w:type="dxa" w:w="960"/>
-          </w:tcPr>
-          <w:p>
-            <w:r>
-              <w:t>BABR</w:t>
-            </w:r>
-          </w:p>
-        </w:tc>
-        <w:tc>
-          <w:tcPr>
-            <w:tcW w:type="dxa" w:w="960"/>
-          </w:tcPr>
-          <w:p>
-            <w:r>
-              <w:t>Pendente</w:t>
-            </w:r>
-          </w:p>
-        </w:tc>
-      </w:tr>
-      <w:tr>
-        <w:tc>
-          <w:tcPr>
-            <w:tcW w:type="dxa" w:w="960"/>
-          </w:tcPr>
-          <w:p>
-            <w:r>
-              <w:t>287</w:t>
-            </w:r>
-          </w:p>
-        </w:tc>
-        <w:tc>
-          <w:tcPr>
-            <w:tcW w:type="dxa" w:w="960"/>
-          </w:tcPr>
-          <w:p>
-            <w:r>
-              <w:t>5111602-16</w:t>
-            </w:r>
-          </w:p>
-        </w:tc>
-        <w:tc>
-          <w:tcPr>
-            <w:tcW w:type="dxa" w:w="960"/>
-          </w:tcPr>
-          <w:p>
-            <w:r>
-              <w:t>GROMMET</w:t>
-            </w:r>
-          </w:p>
-        </w:tc>
-        <w:tc>
-          <w:tcPr>
-            <w:tcW w:type="dxa" w:w="960"/>
-          </w:tcPr>
-          <w:p>
-            <w:r>
-              <w:t>67 EA</w:t>
-            </w:r>
-          </w:p>
-        </w:tc>
-        <w:tc>
-          <w:tcPr>
-            <w:tcW w:type="dxa" w:w="960"/>
-          </w:tcPr>
-          <w:p>
-            <w:r>
-              <w:t>396260016504</w:t>
-            </w:r>
-          </w:p>
-        </w:tc>
-        <w:tc>
-          <w:tcPr>
-            <w:tcW w:type="dxa" w:w="960"/>
-          </w:tcPr>
-          <w:p>
-            <w:r>
-              <w:t>Atender demanda do 2731 durante inspeção com troca de para-brisa.</w:t>
-            </w:r>
-          </w:p>
-        </w:tc>
-        <w:tc>
-          <w:tcPr>
-            <w:tcW w:type="dxa" w:w="960"/>
-          </w:tcPr>
-          <w:p>
-            <w:r>
-              <w:t>2731</w:t>
-            </w:r>
-          </w:p>
-        </w:tc>
-        <w:tc>
-          <w:tcPr>
-            <w:tcW w:type="dxa" w:w="960"/>
-          </w:tcPr>
-          <w:p>
-            <w:r>
-              <w:t>BABE</w:t>
-            </w:r>
-          </w:p>
-        </w:tc>
-        <w:tc>
-          <w:tcPr>
-            <w:tcW w:type="dxa" w:w="960"/>
-          </w:tcPr>
-          <w:p>
-            <w:r>
-              <w:t>Pendente</w:t>
-            </w:r>
-          </w:p>
-        </w:tc>
-      </w:tr>
-      <w:tr>
-        <w:tc>
-          <w:tcPr>
-            <w:tcW w:type="dxa" w:w="960"/>
-          </w:tcPr>
-          <w:p>
-            <w:r>
-              <w:t>288</w:t>
-            </w:r>
-          </w:p>
-        </w:tc>
-        <w:tc>
-          <w:tcPr>
-            <w:tcW w:type="dxa" w:w="960"/>
-          </w:tcPr>
-          <w:p>
-            <w:r>
-              <w:t>2641032-202</w:t>
-            </w:r>
-          </w:p>
-        </w:tc>
-        <w:tc>
-          <w:tcPr>
-            <w:tcW w:type="dxa" w:w="960"/>
-          </w:tcPr>
-          <w:p>
-            <w:r>
-              <w:t>FAIRING AY RH</w:t>
-            </w:r>
-          </w:p>
-        </w:tc>
-        <w:tc>
-          <w:tcPr>
-            <w:tcW w:type="dxa" w:w="960"/>
-          </w:tcPr>
-          <w:p>
-            <w:r>
-              <w:t>01 EA</w:t>
-            </w:r>
-          </w:p>
-        </w:tc>
-        <w:tc>
-          <w:tcPr>
-            <w:tcW w:type="dxa" w:w="960"/>
-          </w:tcPr>
-          <w:p>
-            <w:r>
-              <w:t>313260018291</w:t>
-            </w:r>
-          </w:p>
-        </w:tc>
-        <w:tc>
-          <w:tcPr>
-            <w:tcW w:type="dxa" w:w="960"/>
-          </w:tcPr>
-          <w:p>
-            <w:r>
-              <w:t>Atender emergência por solicitação do SO Rezende. PN da emg 2641030-2</w:t>
-            </w:r>
-          </w:p>
-        </w:tc>
-        <w:tc>
-          <w:tcPr>
-            <w:tcW w:type="dxa" w:w="960"/>
-          </w:tcPr>
-          <w:p>
-            <w:r>
-              <w:t>2741</w:t>
-            </w:r>
-          </w:p>
-        </w:tc>
-        <w:tc>
-          <w:tcPr>
-            <w:tcW w:type="dxa" w:w="960"/>
-          </w:tcPr>
-          <w:p>
-            <w:r>
-              <w:t>BAMN</w:t>
-            </w:r>
-          </w:p>
-        </w:tc>
-        <w:tc>
-          <w:tcPr>
-            <w:tcW w:type="dxa" w:w="960"/>
-          </w:tcPr>
-          <w:p>
-            <w:r>
-              <w:t>Pendente</w:t>
-            </w:r>
-          </w:p>
-        </w:tc>
-      </w:tr>
-      <w:tr>
-        <w:tc>
-          <w:tcPr>
-            <w:tcW w:type="dxa" w:w="960"/>
-          </w:tcPr>
-          <w:p>
-            <w:r>
-              <w:t>289</w:t>
-            </w:r>
-          </w:p>
-        </w:tc>
-        <w:tc>
-          <w:tcPr>
-            <w:tcW w:type="dxa" w:w="960"/>
-          </w:tcPr>
-          <w:p>
-            <w:r>
-              <w:t>850C86-2</w:t>
-            </w:r>
-          </w:p>
-        </w:tc>
-        <w:tc>
-          <w:tcPr>
-            <w:tcW w:type="dxa" w:w="960"/>
-          </w:tcPr>
-          <w:p>
-            <w:r>
-              <w:t>PNEU PRINCIPAL 8.50-10 08PR TT FCIII MLG</w:t>
-            </w:r>
-          </w:p>
-        </w:tc>
-        <w:tc>
-          <w:tcPr>
-            <w:tcW w:type="dxa" w:w="960"/>
-          </w:tcPr>
-          <w:p>
-            <w:r>
-              <w:t>02 EA</w:t>
-            </w:r>
-          </w:p>
-        </w:tc>
-        <w:tc>
-          <w:tcPr>
-            <w:tcW w:type="dxa" w:w="960"/>
-          </w:tcPr>
-          <w:p>
-            <w:r>
-              <w:t>17613579</w:t>
-            </w:r>
-          </w:p>
-        </w:tc>
-        <w:tc>
-          <w:tcPr>
-            <w:tcW w:type="dxa" w:w="960"/>
-          </w:tcPr>
-          <w:p>
-            <w:r>
-              <w:t>Atender demanda do 2709 durante inspeção.</w:t>
-            </w:r>
-          </w:p>
-        </w:tc>
-        <w:tc>
-          <w:tcPr>
-            <w:tcW w:type="dxa" w:w="960"/>
-          </w:tcPr>
-          <w:p>
-            <w:r>
-              <w:t>2709</w:t>
-            </w:r>
-          </w:p>
-        </w:tc>
-        <w:tc>
-          <w:tcPr>
-            <w:tcW w:type="dxa" w:w="960"/>
-          </w:tcPr>
-          <w:p>
-            <w:r>
-              <w:t>BABR</w:t>
-            </w:r>
-          </w:p>
-        </w:tc>
-        <w:tc>
-          <w:tcPr>
-            <w:tcW w:type="dxa" w:w="960"/>
-          </w:tcPr>
-          <w:p>
-            <w:r>
-              <w:t>Pendente</w:t>
-            </w:r>
-          </w:p>
-        </w:tc>
-      </w:tr>
-      <w:tr>
-        <w:tc>
-          <w:tcPr>
-            <w:tcW w:type="dxa" w:w="960"/>
-          </w:tcPr>
-          <w:p>
-            <w:r>
-              <w:t>290</w:t>
-            </w:r>
-          </w:p>
-        </w:tc>
-        <w:tc>
-          <w:tcPr>
-            <w:tcW w:type="dxa" w:w="960"/>
-          </w:tcPr>
-          <w:p>
-            <w:r>
-              <w:t>302-120-402</w:t>
-            </w:r>
-          </w:p>
-        </w:tc>
-        <w:tc>
-          <w:tcPr>
-            <w:tcW w:type="dxa" w:w="960"/>
-          </w:tcPr>
-          <w:p>
-            <w:r>
-              <w:t>INNER TUBE,PNEUMATIC TIRE,AIRCRAFT</w:t>
-            </w:r>
-          </w:p>
-        </w:tc>
-        <w:tc>
-          <w:tcPr>
-            <w:tcW w:type="dxa" w:w="960"/>
-          </w:tcPr>
-          <w:p>
-            <w:r>
-              <w:t>01 EA</w:t>
-            </w:r>
-          </w:p>
-        </w:tc>
-        <w:tc>
-          <w:tcPr>
-            <w:tcW w:type="dxa" w:w="960"/>
-          </w:tcPr>
-          <w:p>
-            <w:r>
-              <w:t>17613601</w:t>
-            </w:r>
-          </w:p>
-        </w:tc>
-        <w:tc>
-          <w:tcPr>
-            <w:tcW w:type="dxa" w:w="960"/>
-          </w:tcPr>
-          <w:p>
-            <w:r>
-              <w:t>Atender demanda do 2709 durante inspeção.</w:t>
-            </w:r>
-          </w:p>
-        </w:tc>
-        <w:tc>
-          <w:tcPr>
-            <w:tcW w:type="dxa" w:w="960"/>
-          </w:tcPr>
-          <w:p>
-            <w:r>
-              <w:t>2709</w:t>
-            </w:r>
-          </w:p>
-        </w:tc>
-        <w:tc>
-          <w:tcPr>
-            <w:tcW w:type="dxa" w:w="960"/>
-          </w:tcPr>
-          <w:p>
-            <w:r>
-              <w:t>BABR</w:t>
-            </w:r>
-          </w:p>
-        </w:tc>
-        <w:tc>
-          <w:tcPr>
-            <w:tcW w:type="dxa" w:w="960"/>
-          </w:tcPr>
-          <w:p>
-            <w:r>
-              <w:t>Pendente</w:t>
-            </w:r>
-          </w:p>
-        </w:tc>
-      </w:tr>
-      <w:tr>
-        <w:tc>
-          <w:tcPr>
-            <w:tcW w:type="dxa" w:w="960"/>
-          </w:tcPr>
-          <w:p>
-            <w:r>
-              <w:t>291</w:t>
-            </w:r>
-          </w:p>
-        </w:tc>
-        <w:tc>
-          <w:tcPr>
-            <w:tcW w:type="dxa" w:w="960"/>
-          </w:tcPr>
-          <w:p>
-            <w:r>
-              <w:t>MS28778-3</w:t>
-            </w:r>
-          </w:p>
-        </w:tc>
-        <w:tc>
-          <w:tcPr>
-            <w:tcW w:type="dxa" w:w="960"/>
-          </w:tcPr>
-          <w:p>
-            <w:r>
-              <w:t>ANEL-O</w:t>
-            </w:r>
-          </w:p>
-        </w:tc>
-        <w:tc>
-          <w:tcPr>
-            <w:tcW w:type="dxa" w:w="960"/>
-          </w:tcPr>
-          <w:p>
-            <w:r>
-              <w:t>06 EA</w:t>
-            </w:r>
-          </w:p>
-        </w:tc>
-        <w:tc>
-          <w:tcPr>
-            <w:tcW w:type="dxa" w:w="960"/>
-          </w:tcPr>
-          <w:p>
-            <w:r>
-              <w:t>17680394</w:t>
-            </w:r>
-          </w:p>
-        </w:tc>
-        <w:tc>
-          <w:tcPr>
-            <w:tcW w:type="dxa" w:w="960"/>
-          </w:tcPr>
-          <w:p>
-            <w:r>
-              <w:t>Atender demanda do 2736</w:t>
-            </w:r>
-          </w:p>
-        </w:tc>
-        <w:tc>
-          <w:tcPr>
-            <w:tcW w:type="dxa" w:w="960"/>
-          </w:tcPr>
-          <w:p>
-            <w:r>
-              <w:t>2736</w:t>
-            </w:r>
-          </w:p>
-        </w:tc>
-        <w:tc>
-          <w:tcPr>
-            <w:tcW w:type="dxa" w:w="960"/>
-          </w:tcPr>
-          <w:p>
-            <w:r>
-              <w:t>BAMN</w:t>
-            </w:r>
-          </w:p>
-        </w:tc>
-        <w:tc>
-          <w:tcPr>
-            <w:tcW w:type="dxa" w:w="960"/>
-          </w:tcPr>
-          <w:p>
-            <w:r>
-              <w:t>Pendente</w:t>
-            </w:r>
-          </w:p>
-        </w:tc>
-      </w:tr>
-      <w:tr>
-        <w:tc>
-          <w:tcPr>
-            <w:tcW w:type="dxa" w:w="960"/>
-          </w:tcPr>
-          <w:p>
-            <w:r>
-              <w:t>292</w:t>
-            </w:r>
-          </w:p>
-        </w:tc>
-        <w:tc>
-          <w:tcPr>
-            <w:tcW w:type="dxa" w:w="960"/>
-          </w:tcPr>
-          <w:p>
-            <w:r>
-              <w:t>AE3663161E0113</w:t>
-            </w:r>
-          </w:p>
-        </w:tc>
-        <w:tc>
-          <w:tcPr>
-            <w:tcW w:type="dxa" w:w="960"/>
-          </w:tcPr>
-          <w:p>
-            <w:r>
-              <w:t>HOSE ASSY</w:t>
-            </w:r>
-          </w:p>
-        </w:tc>
-        <w:tc>
-          <w:tcPr>
-            <w:tcW w:type="dxa" w:w="960"/>
-          </w:tcPr>
-          <w:p>
-            <w:r>
-              <w:t>01 EA</w:t>
-            </w:r>
-          </w:p>
-        </w:tc>
-        <w:tc>
-          <w:tcPr>
-            <w:tcW w:type="dxa" w:w="960"/>
-          </w:tcPr>
-          <w:p>
-            <w:r>
-              <w:t>17695916</w:t>
-            </w:r>
-          </w:p>
-        </w:tc>
-        <w:tc>
-          <w:tcPr>
-            <w:tcW w:type="dxa" w:w="960"/>
-          </w:tcPr>
-          <w:p>
-            <w:r>
-              <w:t>Atender demanda do 2736</w:t>
-            </w:r>
-          </w:p>
-        </w:tc>
-        <w:tc>
-          <w:tcPr>
-            <w:tcW w:type="dxa" w:w="960"/>
-          </w:tcPr>
-          <w:p>
-            <w:r>
-              <w:t>2736</w:t>
-            </w:r>
-          </w:p>
-        </w:tc>
-        <w:tc>
-          <w:tcPr>
-            <w:tcW w:type="dxa" w:w="960"/>
-          </w:tcPr>
-          <w:p>
-            <w:r>
-              <w:t>BAMN</w:t>
-            </w:r>
-          </w:p>
-        </w:tc>
-        <w:tc>
-          <w:tcPr>
-            <w:tcW w:type="dxa" w:w="960"/>
-          </w:tcPr>
-          <w:p>
-            <w:r>
-              <w:t>Pendente</w:t>
-            </w:r>
-          </w:p>
-        </w:tc>
-      </w:tr>
-      <w:tr>
-        <w:tc>
-          <w:tcPr>
-            <w:tcW w:type="dxa" w:w="960"/>
-          </w:tcPr>
-          <w:p>
-            <w:r>
-              <w:t>293</w:t>
-            </w:r>
-          </w:p>
-        </w:tc>
-        <w:tc>
-          <w:tcPr>
-            <w:tcW w:type="dxa" w:w="960"/>
-          </w:tcPr>
-          <w:p>
-            <w:r>
-              <w:t>1414116-7</w:t>
-            </w:r>
-          </w:p>
-        </w:tc>
-        <w:tc>
-          <w:tcPr>
-            <w:tcW w:type="dxa" w:w="960"/>
-          </w:tcPr>
-          <w:p>
-            <w:r>
-              <w:t>SPRING,HELICAL,EXTE</w:t>
-            </w:r>
-          </w:p>
-        </w:tc>
-        <w:tc>
-          <w:tcPr>
-            <w:tcW w:type="dxa" w:w="960"/>
-          </w:tcPr>
-          <w:p>
-            <w:r>
-              <w:t>04 EA</w:t>
-            </w:r>
-          </w:p>
-        </w:tc>
-        <w:tc>
-          <w:tcPr>
-            <w:tcW w:type="dxa" w:w="960"/>
-          </w:tcPr>
-          <w:p>
-            <w:r>
-              <w:t>17739766</w:t>
-            </w:r>
-          </w:p>
-        </w:tc>
-        <w:tc>
-          <w:tcPr>
-            <w:tcW w:type="dxa" w:w="960"/>
-          </w:tcPr>
-          <w:p>
-            <w:r>
-              <w:t>Atender demanda do 2739 durante inspeção</w:t>
-            </w:r>
-          </w:p>
-        </w:tc>
-        <w:tc>
-          <w:tcPr>
-            <w:tcW w:type="dxa" w:w="960"/>
-          </w:tcPr>
-          <w:p>
-            <w:r>
-              <w:t>2739</w:t>
-            </w:r>
-          </w:p>
-        </w:tc>
-        <w:tc>
-          <w:tcPr>
-            <w:tcW w:type="dxa" w:w="960"/>
-          </w:tcPr>
-          <w:p>
-            <w:r>
-              <w:t>BABE</w:t>
-            </w:r>
-          </w:p>
-        </w:tc>
-        <w:tc>
-          <w:tcPr>
-            <w:tcW w:type="dxa" w:w="960"/>
-          </w:tcPr>
-          <w:p>
-            <w:r>
-              <w:t>Pendente</w:t>
-            </w:r>
-          </w:p>
-        </w:tc>
-      </w:tr>
-      <w:tr>
-        <w:tc>
-          <w:tcPr>
-            <w:tcW w:type="dxa" w:w="960"/>
-          </w:tcPr>
-          <w:p>
-            <w:r>
-              <w:t>294</w:t>
-            </w:r>
-          </w:p>
-        </w:tc>
-        <w:tc>
-          <w:tcPr>
-            <w:tcW w:type="dxa" w:w="960"/>
-          </w:tcPr>
-          <w:p>
-            <w:r>
-              <w:t>S1985-1</w:t>
-            </w:r>
-          </w:p>
-        </w:tc>
-        <w:tc>
-          <w:tcPr>
-            <w:tcW w:type="dxa" w:w="960"/>
-          </w:tcPr>
-          <w:p>
-            <w:r>
-              <w:t>SWITCH</w:t>
-            </w:r>
-          </w:p>
-        </w:tc>
-        <w:tc>
-          <w:tcPr>
-            <w:tcW w:type="dxa" w:w="960"/>
-          </w:tcPr>
-          <w:p>
-            <w:r>
-              <w:t>01 EA</w:t>
-            </w:r>
-          </w:p>
-        </w:tc>
-        <w:tc>
-          <w:tcPr>
-            <w:tcW w:type="dxa" w:w="960"/>
-          </w:tcPr>
-          <w:p>
-            <w:r>
-              <w:t>17741001</w:t>
-            </w:r>
-          </w:p>
-        </w:tc>
-        <w:tc>
-          <w:tcPr>
-            <w:tcW w:type="dxa" w:w="960"/>
-          </w:tcPr>
-          <w:p>
-            <w:r>
-              <w:t>Atender demanda do 2708 durante inspeção</w:t>
-            </w:r>
-          </w:p>
-        </w:tc>
-        <w:tc>
-          <w:tcPr>
-            <w:tcW w:type="dxa" w:w="960"/>
-          </w:tcPr>
-          <w:p>
-            <w:r>
-              <w:t>2708</w:t>
-            </w:r>
-          </w:p>
-        </w:tc>
-        <w:tc>
-          <w:tcPr>
-            <w:tcW w:type="dxa" w:w="960"/>
-          </w:tcPr>
-          <w:p>
-            <w:r>
-              <w:t>BANT</w:t>
-            </w:r>
-          </w:p>
-        </w:tc>
-        <w:tc>
-          <w:tcPr>
-            <w:tcW w:type="dxa" w:w="960"/>
-          </w:tcPr>
-          <w:p>
-            <w:r>
-              <w:t>Pendente</w:t>
-            </w:r>
-          </w:p>
-        </w:tc>
-      </w:tr>
-      <w:tr>
-        <w:tc>
-          <w:tcPr>
-            <w:tcW w:type="dxa" w:w="960"/>
-          </w:tcPr>
-          <w:p>
-            <w:r>
-              <w:t>295</w:t>
-            </w:r>
-          </w:p>
-        </w:tc>
-        <w:tc>
-          <w:tcPr>
-            <w:tcW w:type="dxa" w:w="960"/>
-          </w:tcPr>
-          <w:p>
-            <w:r>
-              <w:t>2270030-12</w:t>
-            </w:r>
-          </w:p>
-        </w:tc>
-        <w:tc>
-          <w:tcPr>
-            <w:tcW w:type="dxa" w:w="960"/>
-          </w:tcPr>
-          <w:p>
-            <w:r>
-              <w:t>CABLE ASSEMBLY</w:t>
-            </w:r>
-          </w:p>
-        </w:tc>
-        <w:tc>
-          <w:tcPr>
-            <w:tcW w:type="dxa" w:w="960"/>
-          </w:tcPr>
-          <w:p>
-            <w:r>
-              <w:t>01 EA</w:t>
-            </w:r>
-          </w:p>
-        </w:tc>
-        <w:tc>
-          <w:tcPr>
-            <w:tcW w:type="dxa" w:w="960"/>
-          </w:tcPr>
-          <w:p>
-            <w:r>
-              <w:t>17741040</w:t>
-            </w:r>
-          </w:p>
-        </w:tc>
-        <w:tc>
-          <w:tcPr>
-            <w:tcW w:type="dxa" w:w="960"/>
-          </w:tcPr>
-          <w:p>
-            <w:r>
-              <w:t>Atender demanda do 2708 durante inspeção</w:t>
-            </w:r>
-          </w:p>
-        </w:tc>
-        <w:tc>
-          <w:tcPr>
-            <w:tcW w:type="dxa" w:w="960"/>
-          </w:tcPr>
-          <w:p>
-            <w:r>
-              <w:t>2708</w:t>
-            </w:r>
-          </w:p>
-        </w:tc>
-        <w:tc>
-          <w:tcPr>
-            <w:tcW w:type="dxa" w:w="960"/>
-          </w:tcPr>
-          <w:p>
-            <w:r>
-              <w:t>BANT</w:t>
-            </w:r>
-          </w:p>
-        </w:tc>
-        <w:tc>
-          <w:tcPr>
-            <w:tcW w:type="dxa" w:w="960"/>
-          </w:tcPr>
-          <w:p>
-            <w:r>
-              <w:t>Pendente</w:t>
-            </w:r>
-          </w:p>
-        </w:tc>
-      </w:tr>
-      <w:tr>
-        <w:tc>
-          <w:tcPr>
-            <w:tcW w:type="dxa" w:w="960"/>
-          </w:tcPr>
-          <w:p>
-            <w:r>
-              <w:t>296</w:t>
-            </w:r>
-          </w:p>
-        </w:tc>
-        <w:tc>
-          <w:tcPr>
-            <w:tcW w:type="dxa" w:w="960"/>
-          </w:tcPr>
-          <w:p>
-            <w:r>
-              <w:t>066-4010-12</w:t>
-            </w:r>
-          </w:p>
-        </w:tc>
-        <w:tc>
-          <w:tcPr>
-            <w:tcW w:type="dxa" w:w="960"/>
-          </w:tcPr>
-          <w:p>
-            <w:r>
-              <w:t>RECEIVER VOR/LOC (KNS81)</w:t>
-            </w:r>
-          </w:p>
-        </w:tc>
-        <w:tc>
-          <w:tcPr>
-            <w:tcW w:type="dxa" w:w="960"/>
-          </w:tcPr>
-          <w:p>
-            <w:r>
-              <w:t>01 EA</w:t>
-            </w:r>
-          </w:p>
-        </w:tc>
-        <w:tc>
-          <w:tcPr>
-            <w:tcW w:type="dxa" w:w="960"/>
-          </w:tcPr>
-          <w:p>
-            <w:r>
-              <w:t>17741660</w:t>
-            </w:r>
-          </w:p>
-        </w:tc>
-        <w:tc>
-          <w:tcPr>
-            <w:tcW w:type="dxa" w:w="960"/>
-          </w:tcPr>
-          <w:p>
-            <w:r>
-              <w:t>Atender demanda do 2708 durante inspeção</w:t>
-            </w:r>
-          </w:p>
-        </w:tc>
-        <w:tc>
-          <w:tcPr>
-            <w:tcW w:type="dxa" w:w="960"/>
-          </w:tcPr>
-          <w:p>
-            <w:r>
-              <w:t>2708</w:t>
-            </w:r>
-          </w:p>
-        </w:tc>
-        <w:tc>
-          <w:tcPr>
-            <w:tcW w:type="dxa" w:w="960"/>
-          </w:tcPr>
-          <w:p>
-            <w:r>
-              <w:t>BANT</w:t>
-            </w:r>
-          </w:p>
-        </w:tc>
-        <w:tc>
-          <w:tcPr>
-            <w:tcW w:type="dxa" w:w="960"/>
-          </w:tcPr>
-          <w:p>
-            <w:r>
-              <w:t>Pendente</w:t>
-            </w:r>
-          </w:p>
-        </w:tc>
-      </w:tr>
-      <w:tr>
-        <w:tc>
-          <w:tcPr>
-            <w:tcW w:type="dxa" w:w="960"/>
-          </w:tcPr>
-          <w:p>
-            <w:r>
-              <w:t>297</w:t>
-            </w:r>
-          </w:p>
-        </w:tc>
-        <w:tc>
-          <w:tcPr>
-            <w:tcW w:type="dxa" w:w="960"/>
-          </w:tcPr>
-          <w:p>
-            <w:r>
-              <w:t>3034792</w:t>
-            </w:r>
-          </w:p>
-        </w:tc>
-        <w:tc>
-          <w:tcPr>
-            <w:tcW w:type="dxa" w:w="960"/>
-          </w:tcPr>
-          <w:p>
-            <w:r>
-              <w:t>BOMBA DE COMBUSTÍVEL</w:t>
-            </w:r>
-          </w:p>
-        </w:tc>
-        <w:tc>
-          <w:tcPr>
-            <w:tcW w:type="dxa" w:w="960"/>
-          </w:tcPr>
-          <w:p>
-            <w:r>
-              <w:t>01 EA</w:t>
-            </w:r>
-          </w:p>
-        </w:tc>
-        <w:tc>
-          <w:tcPr>
-            <w:tcW w:type="dxa" w:w="960"/>
-          </w:tcPr>
-          <w:p>
-            <w:r>
-              <w:t>17743998</w:t>
-            </w:r>
-          </w:p>
-        </w:tc>
-        <w:tc>
-          <w:tcPr>
-            <w:tcW w:type="dxa" w:w="960"/>
-          </w:tcPr>
-          <w:p>
-            <w:r>
-              <w:t>Atender demanda do 2742 para solução de pane no sistema de combustível</w:t>
-            </w:r>
-          </w:p>
-        </w:tc>
-        <w:tc>
-          <w:tcPr>
-            <w:tcW w:type="dxa" w:w="960"/>
-          </w:tcPr>
-          <w:p>
-            <w:r>
-              <w:t>2742</w:t>
-            </w:r>
-          </w:p>
-        </w:tc>
-        <w:tc>
-          <w:tcPr>
-            <w:tcW w:type="dxa" w:w="960"/>
-          </w:tcPr>
-          <w:p>
-            <w:r>
-              <w:t>DACTA II</w:t>
-            </w:r>
-          </w:p>
-        </w:tc>
-        <w:tc>
-          <w:tcPr>
-            <w:tcW w:type="dxa" w:w="960"/>
-          </w:tcPr>
-          <w:p>
-            <w:r>
-              <w:t>Pendente</w:t>
-            </w:r>
-          </w:p>
-        </w:tc>
-      </w:tr>
-      <w:tr>
-        <w:tc>
-          <w:tcPr>
-            <w:tcW w:type="dxa" w:w="960"/>
-          </w:tcPr>
-          <w:p>
-            <w:r>
-              <w:t>298</w:t>
-            </w:r>
-          </w:p>
-        </w:tc>
-        <w:tc>
-          <w:tcPr>
-            <w:tcW w:type="dxa" w:w="960"/>
-          </w:tcPr>
-          <w:p>
-            <w:r>
-              <w:t>3024973</w:t>
-            </w:r>
-          </w:p>
-        </w:tc>
-        <w:tc>
-          <w:tcPr>
-            <w:tcW w:type="dxa" w:w="960"/>
-          </w:tcPr>
-          <w:p>
-            <w:r>
-              <w:t>COUPLING,PUMP</w:t>
-            </w:r>
-          </w:p>
-        </w:tc>
-        <w:tc>
-          <w:tcPr>
-            <w:tcW w:type="dxa" w:w="960"/>
-          </w:tcPr>
-          <w:p>
-            <w:r>
-              <w:t>01 EA</w:t>
-            </w:r>
-          </w:p>
-        </w:tc>
-        <w:tc>
-          <w:tcPr>
-            <w:tcW w:type="dxa" w:w="960"/>
-          </w:tcPr>
-          <w:p>
-            <w:r>
-              <w:t>17743997</w:t>
-            </w:r>
-          </w:p>
-        </w:tc>
-        <w:tc>
-          <w:tcPr>
-            <w:tcW w:type="dxa" w:w="960"/>
-          </w:tcPr>
-          <w:p>
-            <w:r>
-              <w:t>Atender demanda do 2742 para solução de pane no sistema de combustível</w:t>
-            </w:r>
-          </w:p>
-        </w:tc>
-        <w:tc>
-          <w:tcPr>
-            <w:tcW w:type="dxa" w:w="960"/>
-          </w:tcPr>
-          <w:p>
-            <w:r>
-              <w:t>2742</w:t>
-            </w:r>
-          </w:p>
-        </w:tc>
-        <w:tc>
-          <w:tcPr>
-            <w:tcW w:type="dxa" w:w="960"/>
-          </w:tcPr>
-          <w:p>
-            <w:r>
-              <w:t>DACTA II</w:t>
-            </w:r>
-          </w:p>
-        </w:tc>
-        <w:tc>
-          <w:tcPr>
-            <w:tcW w:type="dxa" w:w="960"/>
-          </w:tcPr>
-          <w:p>
-            <w:r>
-              <w:t>Pendente</w:t>
-            </w:r>
-          </w:p>
-        </w:tc>
-      </w:tr>
-      <w:tr>
-        <w:tc>
-          <w:tcPr>
-            <w:tcW w:type="dxa" w:w="960"/>
-          </w:tcPr>
-          <w:p>
-            <w:r>
-              <w:t>299</w:t>
-            </w:r>
-          </w:p>
-        </w:tc>
-        <w:tc>
-          <w:tcPr>
-            <w:tcW w:type="dxa" w:w="960"/>
-          </w:tcPr>
-          <w:p>
-            <w:r>
-              <w:t>M83461/1-012</w:t>
-            </w:r>
-          </w:p>
-        </w:tc>
-        <w:tc>
-          <w:tcPr>
-            <w:tcW w:type="dxa" w:w="960"/>
-          </w:tcPr>
-          <w:p>
-            <w:r>
-              <w:t>ANEL-O</w:t>
-            </w:r>
-          </w:p>
-        </w:tc>
-        <w:tc>
-          <w:tcPr>
-            <w:tcW w:type="dxa" w:w="960"/>
-          </w:tcPr>
-          <w:p>
-            <w:r>
-              <w:t>01 EA</w:t>
-            </w:r>
-          </w:p>
-        </w:tc>
-        <w:tc>
-          <w:tcPr>
-            <w:tcW w:type="dxa" w:w="960"/>
-          </w:tcPr>
-          <w:p>
-            <w:r>
-              <w:t>17744000</w:t>
-            </w:r>
-          </w:p>
-        </w:tc>
-        <w:tc>
-          <w:tcPr>
-            <w:tcW w:type="dxa" w:w="960"/>
-          </w:tcPr>
-          <w:p>
-            <w:r>
-              <w:t>Atender demanda do 2742 para solução de pane no sistema de combustível</w:t>
-            </w:r>
-          </w:p>
-        </w:tc>
-        <w:tc>
-          <w:tcPr>
-            <w:tcW w:type="dxa" w:w="960"/>
-          </w:tcPr>
-          <w:p>
-            <w:r>
-              <w:t>2742</w:t>
-            </w:r>
-          </w:p>
-        </w:tc>
-        <w:tc>
-          <w:tcPr>
-            <w:tcW w:type="dxa" w:w="960"/>
-          </w:tcPr>
-          <w:p>
-            <w:r>
-              <w:t>DACTA II</w:t>
-            </w:r>
-          </w:p>
-        </w:tc>
-        <w:tc>
-          <w:tcPr>
-            <w:tcW w:type="dxa" w:w="960"/>
-          </w:tcPr>
-          <w:p>
-            <w:r>
-              <w:t>Pendente</w:t>
-            </w:r>
-          </w:p>
-        </w:tc>
-      </w:tr>
-      <w:tr>
-        <w:tc>
-          <w:tcPr>
-            <w:tcW w:type="dxa" w:w="960"/>
-          </w:tcPr>
-          <w:p>
-            <w:r>
-              <w:t>300</w:t>
-            </w:r>
-          </w:p>
-        </w:tc>
-        <w:tc>
-          <w:tcPr>
-            <w:tcW w:type="dxa" w:w="960"/>
-          </w:tcPr>
-          <w:p>
-            <w:r>
-              <w:t>3039937</w:t>
-            </w:r>
-          </w:p>
-        </w:tc>
-        <w:tc>
-          <w:tcPr>
-            <w:tcW w:type="dxa" w:w="960"/>
-          </w:tcPr>
-          <w:p>
-            <w:r>
-              <w:t>GASKET</w:t>
-            </w:r>
-          </w:p>
-        </w:tc>
-        <w:tc>
-          <w:tcPr>
-            <w:tcW w:type="dxa" w:w="960"/>
-          </w:tcPr>
-          <w:p>
-            <w:r>
-              <w:t>01 EA</w:t>
-            </w:r>
-          </w:p>
-        </w:tc>
-        <w:tc>
-          <w:tcPr>
-            <w:tcW w:type="dxa" w:w="960"/>
-          </w:tcPr>
-          <w:p>
-            <w:r>
-              <w:t>17743999</w:t>
-            </w:r>
-          </w:p>
-        </w:tc>
-        <w:tc>
-          <w:tcPr>
-            <w:tcW w:type="dxa" w:w="960"/>
-          </w:tcPr>
-          <w:p>
-            <w:r>
-              <w:t>Atender demanda do 2742 para solução de pane no sistema de combustível</w:t>
-            </w:r>
-          </w:p>
-        </w:tc>
-        <w:tc>
-          <w:tcPr>
-            <w:tcW w:type="dxa" w:w="960"/>
-          </w:tcPr>
-          <w:p>
-            <w:r>
-              <w:t>2742</w:t>
-            </w:r>
-          </w:p>
-        </w:tc>
-        <w:tc>
-          <w:tcPr>
-            <w:tcW w:type="dxa" w:w="960"/>
-          </w:tcPr>
-          <w:p>
-            <w:r>
-              <w:t>DACTA II</w:t>
-            </w:r>
-          </w:p>
-        </w:tc>
-        <w:tc>
-          <w:tcPr>
-            <w:tcW w:type="dxa" w:w="960"/>
-          </w:tcPr>
-          <w:p>
-            <w:r>
-              <w:t>Pendente</w:t>
-            </w:r>
-          </w:p>
-        </w:tc>
-      </w:tr>
-      <w:tr>
-        <w:tc>
-          <w:tcPr>
-            <w:tcW w:type="dxa" w:w="960"/>
-          </w:tcPr>
-          <w:p>
-            <w:r>
-              <w:t>301</w:t>
-            </w:r>
-          </w:p>
-        </w:tc>
-        <w:tc>
-          <w:tcPr>
-            <w:tcW w:type="dxa" w:w="960"/>
-          </w:tcPr>
-          <w:p>
-            <w:r>
-              <w:t>3014227</w:t>
-            </w:r>
-          </w:p>
-        </w:tc>
-        <w:tc>
-          <w:tcPr>
-            <w:tcW w:type="dxa" w:w="960"/>
-          </w:tcPr>
-          <w:p>
-            <w:r>
-              <w:t>ANEL-O</w:t>
-            </w:r>
-          </w:p>
-        </w:tc>
-        <w:tc>
-          <w:tcPr>
-            <w:tcW w:type="dxa" w:w="960"/>
-          </w:tcPr>
-          <w:p>
-            <w:r>
-              <w:t>01 EA</w:t>
-            </w:r>
-          </w:p>
-        </w:tc>
-        <w:tc>
-          <w:tcPr>
-            <w:tcW w:type="dxa" w:w="960"/>
-          </w:tcPr>
-          <w:p>
-            <w:r>
-              <w:t>17743996</w:t>
-            </w:r>
-          </w:p>
-        </w:tc>
-        <w:tc>
-          <w:tcPr>
-            <w:tcW w:type="dxa" w:w="960"/>
-          </w:tcPr>
-          <w:p>
-            <w:r>
-              <w:t>Atender demanda do 2742 para solução de pane no sistema de combustível</w:t>
-            </w:r>
-          </w:p>
-        </w:tc>
-        <w:tc>
-          <w:tcPr>
-            <w:tcW w:type="dxa" w:w="960"/>
-          </w:tcPr>
-          <w:p>
-            <w:r>
-              <w:t>2742</w:t>
-            </w:r>
-          </w:p>
-        </w:tc>
-        <w:tc>
-          <w:tcPr>
-            <w:tcW w:type="dxa" w:w="960"/>
-          </w:tcPr>
-          <w:p>
-            <w:r>
-              <w:t>DACTA II</w:t>
-            </w:r>
-          </w:p>
-        </w:tc>
-        <w:tc>
-          <w:tcPr>
-            <w:tcW w:type="dxa" w:w="960"/>
-          </w:tcPr>
-          <w:p>
-            <w:r>
-              <w:t>Pendente</w:t>
-            </w:r>
-          </w:p>
-        </w:tc>
-      </w:tr>
-      <w:tr>
-        <w:tc>
-          <w:tcPr>
-            <w:tcW w:type="dxa" w:w="960"/>
-          </w:tcPr>
-          <w:p>
-            <w:r>
-              <w:t>302</w:t>
-            </w:r>
-          </w:p>
-        </w:tc>
-        <w:tc>
-          <w:tcPr>
-            <w:tcW w:type="dxa" w:w="960"/>
-          </w:tcPr>
-          <w:p>
-            <w:r>
-              <w:t>C668050-1108</w:t>
-            </w:r>
-          </w:p>
-        </w:tc>
-        <w:tc>
-          <w:tcPr>
-            <w:tcW w:type="dxa" w:w="960"/>
-          </w:tcPr>
-          <w:p>
-            <w:r>
-              <w:t>TRANSMITTER FUEL</w:t>
-            </w:r>
-          </w:p>
-        </w:tc>
-        <w:tc>
-          <w:tcPr>
-            <w:tcW w:type="dxa" w:w="960"/>
-          </w:tcPr>
-          <w:p>
-            <w:r>
-              <w:t>01 EA</w:t>
-            </w:r>
-          </w:p>
-        </w:tc>
-        <w:tc>
-          <w:tcPr>
-            <w:tcW w:type="dxa" w:w="960"/>
-          </w:tcPr>
-          <w:p>
-            <w:r>
-              <w:t>17800378</w:t>
-            </w:r>
-          </w:p>
-        </w:tc>
-        <w:tc>
-          <w:tcPr>
-            <w:tcW w:type="dxa" w:w="960"/>
-          </w:tcPr>
-          <w:p>
-            <w:r>
-              <w:t>Atender demanda do 2723</w:t>
-            </w:r>
-          </w:p>
-        </w:tc>
-        <w:tc>
-          <w:tcPr>
-            <w:tcW w:type="dxa" w:w="960"/>
-          </w:tcPr>
-          <w:p>
-            <w:r>
-              <w:t>2723</w:t>
-            </w:r>
-          </w:p>
-        </w:tc>
-        <w:tc>
-          <w:tcPr>
-            <w:tcW w:type="dxa" w:w="960"/>
-          </w:tcPr>
-          <w:p>
-            <w:r>
-              <w:t>BABE</w:t>
-            </w:r>
-          </w:p>
-        </w:tc>
-        <w:tc>
-          <w:tcPr>
-            <w:tcW w:type="dxa" w:w="960"/>
-          </w:tcPr>
-          <w:p>
-            <w:r>
-              <w:t>Pendente</w:t>
-            </w:r>
-          </w:p>
-        </w:tc>
-      </w:tr>
-      <w:tr>
-        <w:tc>
-          <w:tcPr>
-            <w:tcW w:type="dxa" w:w="960"/>
-          </w:tcPr>
-          <w:p>
-            <w:r>
-              <w:t>303</w:t>
-            </w:r>
-          </w:p>
-        </w:tc>
-        <w:tc>
-          <w:tcPr>
-            <w:tcW w:type="dxa" w:w="960"/>
-          </w:tcPr>
-          <w:p>
-            <w:r>
-              <w:t>2522275-1</w:t>
-            </w:r>
-          </w:p>
-        </w:tc>
-        <w:tc>
-          <w:tcPr>
-            <w:tcW w:type="dxa" w:w="960"/>
-          </w:tcPr>
-          <w:p>
-            <w:r>
-              <w:t>PLATE-INSULAT</w:t>
-            </w:r>
-          </w:p>
-        </w:tc>
-        <w:tc>
-          <w:tcPr>
-            <w:tcW w:type="dxa" w:w="960"/>
-          </w:tcPr>
-          <w:p>
-            <w:r>
-              <w:t>02 EA</w:t>
-            </w:r>
-          </w:p>
-        </w:tc>
-        <w:tc>
-          <w:tcPr>
-            <w:tcW w:type="dxa" w:w="960"/>
-          </w:tcPr>
-          <w:p>
-            <w:r>
-              <w:t>17800557</w:t>
-            </w:r>
-          </w:p>
-        </w:tc>
-        <w:tc>
-          <w:tcPr>
-            <w:tcW w:type="dxa" w:w="960"/>
-          </w:tcPr>
-          <w:p>
-            <w:r>
-              <w:t>Atender demanda do 2723</w:t>
-            </w:r>
-          </w:p>
-        </w:tc>
-        <w:tc>
-          <w:tcPr>
-            <w:tcW w:type="dxa" w:w="960"/>
-          </w:tcPr>
-          <w:p>
-            <w:r>
-              <w:t>2723</w:t>
-            </w:r>
-          </w:p>
-        </w:tc>
-        <w:tc>
-          <w:tcPr>
-            <w:tcW w:type="dxa" w:w="960"/>
-          </w:tcPr>
-          <w:p>
-            <w:r>
-              <w:t>BABE</w:t>
-            </w:r>
-          </w:p>
-        </w:tc>
-        <w:tc>
-          <w:tcPr>
-            <w:tcW w:type="dxa" w:w="960"/>
-          </w:tcPr>
-          <w:p>
-            <w:r>
-              <w:t>Pendente</w:t>
-            </w:r>
-          </w:p>
-        </w:tc>
-      </w:tr>
-      <w:tr>
-        <w:tc>
-          <w:tcPr>
-            <w:tcW w:type="dxa" w:w="960"/>
-          </w:tcPr>
-          <w:p>
-            <w:r>
-              <w:t>304</w:t>
-            </w:r>
-          </w:p>
-        </w:tc>
-        <w:tc>
-          <w:tcPr>
-            <w:tcW w:type="dxa" w:w="960"/>
-          </w:tcPr>
-          <w:p>
-            <w:r>
-              <w:t>S2870-1</w:t>
-            </w:r>
-          </w:p>
-        </w:tc>
-        <w:tc>
-          <w:tcPr>
-            <w:tcW w:type="dxa" w:w="960"/>
-          </w:tcPr>
-          <w:p>
-            <w:r>
-              <w:t>SWITCH,SPEC</w:t>
-            </w:r>
-          </w:p>
-        </w:tc>
-        <w:tc>
-          <w:tcPr>
-            <w:tcW w:type="dxa" w:w="960"/>
-          </w:tcPr>
-          <w:p>
-            <w:r>
-              <w:t>02 EA</w:t>
-            </w:r>
-          </w:p>
-        </w:tc>
-        <w:tc>
-          <w:tcPr>
-            <w:tcW w:type="dxa" w:w="960"/>
-          </w:tcPr>
-          <w:p>
-            <w:r>
-              <w:t>17800394</w:t>
-            </w:r>
-          </w:p>
-        </w:tc>
-        <w:tc>
-          <w:tcPr>
-            <w:tcW w:type="dxa" w:w="960"/>
-          </w:tcPr>
-          <w:p>
-            <w:r>
-              <w:t>Atender demanda do 2723</w:t>
-            </w:r>
-          </w:p>
-        </w:tc>
-        <w:tc>
-          <w:tcPr>
-            <w:tcW w:type="dxa" w:w="960"/>
-          </w:tcPr>
-          <w:p>
-            <w:r>
-              <w:t>2723</w:t>
-            </w:r>
-          </w:p>
-        </w:tc>
-        <w:tc>
-          <w:tcPr>
-            <w:tcW w:type="dxa" w:w="960"/>
-          </w:tcPr>
-          <w:p>
-            <w:r>
-              <w:t>BABE</w:t>
-            </w:r>
-          </w:p>
-        </w:tc>
-        <w:tc>
-          <w:tcPr>
-            <w:tcW w:type="dxa" w:w="960"/>
-          </w:tcPr>
-          <w:p>
-            <w:r>
-              <w:t>Pendente</w:t>
-            </w:r>
-          </w:p>
-        </w:tc>
-      </w:tr>
-      <w:tr>
-        <w:tc>
-          <w:tcPr>
-            <w:tcW w:type="dxa" w:w="960"/>
-          </w:tcPr>
-          <w:p>
-            <w:r>
-              <w:t>305</w:t>
-            </w:r>
-          </w:p>
-        </w:tc>
-        <w:tc>
-          <w:tcPr>
-            <w:tcW w:type="dxa" w:w="960"/>
-          </w:tcPr>
-          <w:p>
-            <w:r>
-              <w:t>NSL 1422 B2</w:t>
-            </w:r>
-          </w:p>
-        </w:tc>
-        <w:tc>
-          <w:tcPr>
-            <w:tcW w:type="dxa" w:w="960"/>
-          </w:tcPr>
-          <w:p>
-            <w:r>
-              <w:t>SEALING COMPOUND</w:t>
-            </w:r>
-          </w:p>
-        </w:tc>
-        <w:tc>
-          <w:tcPr>
-            <w:tcW w:type="dxa" w:w="960"/>
-          </w:tcPr>
-          <w:p>
-            <w:r>
-              <w:t>06 EA</w:t>
-            </w:r>
-          </w:p>
-        </w:tc>
-        <w:tc>
-          <w:tcPr>
-            <w:tcW w:type="dxa" w:w="960"/>
-          </w:tcPr>
-          <w:p>
-            <w:r>
-              <w:t>17800330</w:t>
-            </w:r>
-          </w:p>
-        </w:tc>
-        <w:tc>
-          <w:tcPr>
-            <w:tcW w:type="dxa" w:w="960"/>
-          </w:tcPr>
-          <w:p>
-            <w:r>
-              <w:t>Atender demanda do 2723</w:t>
-            </w:r>
-          </w:p>
-        </w:tc>
-        <w:tc>
-          <w:tcPr>
-            <w:tcW w:type="dxa" w:w="960"/>
-          </w:tcPr>
-          <w:p>
-            <w:r>
-              <w:t>2723</w:t>
-            </w:r>
-          </w:p>
-        </w:tc>
-        <w:tc>
-          <w:tcPr>
-            <w:tcW w:type="dxa" w:w="960"/>
-          </w:tcPr>
-          <w:p>
-            <w:r>
-              <w:t>BABE</w:t>
-            </w:r>
-          </w:p>
-        </w:tc>
-        <w:tc>
-          <w:tcPr>
-            <w:tcW w:type="dxa" w:w="960"/>
-          </w:tcPr>
-          <w:p>
-            <w:r>
-              <w:t>Pendente</w:t>
-            </w:r>
-          </w:p>
-        </w:tc>
-      </w:tr>
-      <w:tr>
-        <w:tc>
-          <w:tcPr>
-            <w:tcW w:type="dxa" w:w="960"/>
-          </w:tcPr>
-          <w:p>
-            <w:r>
-              <w:t>306</w:t>
-            </w:r>
-          </w:p>
-        </w:tc>
-        <w:tc>
-          <w:tcPr>
-            <w:tcW w:type="dxa" w:w="960"/>
-          </w:tcPr>
-          <w:p>
-            <w:r>
-              <w:t>AN320-3</w:t>
-            </w:r>
-          </w:p>
-        </w:tc>
-        <w:tc>
-          <w:tcPr>
-            <w:tcW w:type="dxa" w:w="960"/>
-          </w:tcPr>
-          <w:p>
-            <w:r>
-              <w:t>NUT,PLAIN,SLOTTED,HEXAGON</w:t>
-            </w:r>
-          </w:p>
-        </w:tc>
-        <w:tc>
-          <w:tcPr>
-            <w:tcW w:type="dxa" w:w="960"/>
-          </w:tcPr>
-          <w:p>
-            <w:r>
-              <w:t>04 EA</w:t>
-            </w:r>
-          </w:p>
-        </w:tc>
-        <w:tc>
-          <w:tcPr>
-            <w:tcW w:type="dxa" w:w="960"/>
-          </w:tcPr>
-          <w:p>
-            <w:r>
-              <w:t>17823231</w:t>
-            </w:r>
-          </w:p>
-        </w:tc>
-        <w:tc>
-          <w:tcPr>
-            <w:tcW w:type="dxa" w:w="960"/>
-          </w:tcPr>
-          <w:p>
-            <w:r>
-              <w:t>Atender demanda do 2709</w:t>
-            </w:r>
-          </w:p>
-        </w:tc>
-        <w:tc>
-          <w:tcPr>
-            <w:tcW w:type="dxa" w:w="960"/>
-          </w:tcPr>
-          <w:p>
-            <w:r>
-              <w:t>2709</w:t>
-            </w:r>
-          </w:p>
-        </w:tc>
-        <w:tc>
-          <w:tcPr>
-            <w:tcW w:type="dxa" w:w="960"/>
-          </w:tcPr>
-          <w:p>
-            <w:r>
-              <w:t>BABR</w:t>
-            </w:r>
-          </w:p>
-        </w:tc>
-        <w:tc>
-          <w:tcPr>
-            <w:tcW w:type="dxa" w:w="960"/>
-          </w:tcPr>
-          <w:p>
-            <w:r>
-              <w:t>Pendente</w:t>
-            </w:r>
-          </w:p>
-        </w:tc>
-      </w:tr>
-      <w:tr>
-        <w:tc>
-          <w:tcPr>
-            <w:tcW w:type="dxa" w:w="960"/>
-          </w:tcPr>
-          <w:p>
-            <w:r>
-              <w:t>307</w:t>
-            </w:r>
-          </w:p>
-        </w:tc>
-        <w:tc>
-          <w:tcPr>
-            <w:tcW w:type="dxa" w:w="960"/>
-          </w:tcPr>
-          <w:p>
-            <w:r>
-              <w:t>2613419-1</w:t>
-            </w:r>
-          </w:p>
-        </w:tc>
-        <w:tc>
-          <w:tcPr>
-            <w:tcW w:type="dxa" w:w="960"/>
-          </w:tcPr>
-          <w:p>
-            <w:r>
-              <w:t>BARREL FLAP</w:t>
-            </w:r>
-          </w:p>
-        </w:tc>
-        <w:tc>
-          <w:tcPr>
-            <w:tcW w:type="dxa" w:w="960"/>
-          </w:tcPr>
-          <w:p>
-            <w:r>
-              <w:t>01 EA</w:t>
-            </w:r>
-          </w:p>
-        </w:tc>
-        <w:tc>
-          <w:tcPr>
-            <w:tcW w:type="dxa" w:w="960"/>
-          </w:tcPr>
-          <w:p>
-            <w:r>
-              <w:t>17823328</w:t>
-            </w:r>
-          </w:p>
-        </w:tc>
-        <w:tc>
-          <w:tcPr>
-            <w:tcW w:type="dxa" w:w="960"/>
-          </w:tcPr>
-          <w:p>
-            <w:r>
-              <w:t>Atender demanda do 2709</w:t>
-            </w:r>
-          </w:p>
-        </w:tc>
-        <w:tc>
-          <w:tcPr>
-            <w:tcW w:type="dxa" w:w="960"/>
-          </w:tcPr>
-          <w:p>
-            <w:r>
-              <w:t>2709</w:t>
-            </w:r>
-          </w:p>
-        </w:tc>
-        <w:tc>
-          <w:tcPr>
-            <w:tcW w:type="dxa" w:w="960"/>
-          </w:tcPr>
-          <w:p>
-            <w:r>
-              <w:t>BABR</w:t>
-            </w:r>
-          </w:p>
-        </w:tc>
-        <w:tc>
-          <w:tcPr>
-            <w:tcW w:type="dxa" w:w="960"/>
-          </w:tcPr>
-          <w:p>
-            <w:r>
-              <w:t>Pendente</w:t>
-            </w:r>
-          </w:p>
-        </w:tc>
-      </w:tr>
-      <w:tr>
-        <w:tc>
-          <w:tcPr>
-            <w:tcW w:type="dxa" w:w="960"/>
-          </w:tcPr>
-          <w:p>
-            <w:r>
-              <w:t>308</w:t>
-            </w:r>
-          </w:p>
-        </w:tc>
-        <w:tc>
-          <w:tcPr>
-            <w:tcW w:type="dxa" w:w="960"/>
-          </w:tcPr>
-          <w:p>
-            <w:r>
-              <w:t>AN565B428H4</w:t>
-            </w:r>
-          </w:p>
-        </w:tc>
-        <w:tc>
-          <w:tcPr>
-            <w:tcW w:type="dxa" w:w="960"/>
-          </w:tcPr>
-          <w:p>
-            <w:r>
-              <w:t>SETSCREW</w:t>
-            </w:r>
-          </w:p>
-        </w:tc>
-        <w:tc>
-          <w:tcPr>
-            <w:tcW w:type="dxa" w:w="960"/>
-          </w:tcPr>
-          <w:p>
-            <w:r>
-              <w:t>02 EA</w:t>
-            </w:r>
-          </w:p>
-        </w:tc>
-        <w:tc>
-          <w:tcPr>
-            <w:tcW w:type="dxa" w:w="960"/>
-          </w:tcPr>
-          <w:p>
-            <w:r>
-              <w:t>17823233</w:t>
-            </w:r>
-          </w:p>
-        </w:tc>
-        <w:tc>
-          <w:tcPr>
-            <w:tcW w:type="dxa" w:w="960"/>
-          </w:tcPr>
-          <w:p>
-            <w:r>
-              <w:t>Atender demanda do 2709</w:t>
-            </w:r>
-          </w:p>
-        </w:tc>
-        <w:tc>
-          <w:tcPr>
-            <w:tcW w:type="dxa" w:w="960"/>
-          </w:tcPr>
-          <w:p>
-            <w:r>
-              <w:t>2709</w:t>
-            </w:r>
-          </w:p>
-        </w:tc>
-        <w:tc>
-          <w:tcPr>
-            <w:tcW w:type="dxa" w:w="960"/>
-          </w:tcPr>
-          <w:p>
-            <w:r>
-              <w:t>BABR</w:t>
-            </w:r>
-          </w:p>
-        </w:tc>
-        <w:tc>
-          <w:tcPr>
-            <w:tcW w:type="dxa" w:w="960"/>
-          </w:tcPr>
-          <w:p>
-            <w:r>
-              <w:t>Pendente</w:t>
-            </w:r>
-          </w:p>
-        </w:tc>
-      </w:tr>
-      <w:tr>
-        <w:tc>
-          <w:tcPr>
-            <w:tcW w:type="dxa" w:w="960"/>
-          </w:tcPr>
-          <w:p>
-            <w:r>
-              <w:t>309</w:t>
-            </w:r>
-          </w:p>
-        </w:tc>
-        <w:tc>
-          <w:tcPr>
-            <w:tcW w:type="dxa" w:w="960"/>
-          </w:tcPr>
-          <w:p>
-            <w:r>
-              <w:t>2662007-4</w:t>
-            </w:r>
-          </w:p>
-        </w:tc>
-        <w:tc>
-          <w:tcPr>
-            <w:tcW w:type="dxa" w:w="960"/>
-          </w:tcPr>
-          <w:p>
-            <w:r>
-              <w:t>STUD</w:t>
-            </w:r>
-          </w:p>
-        </w:tc>
-        <w:tc>
-          <w:tcPr>
-            <w:tcW w:type="dxa" w:w="960"/>
-          </w:tcPr>
-          <w:p>
-            <w:r>
-              <w:t>02 EA</w:t>
-            </w:r>
-          </w:p>
-        </w:tc>
-        <w:tc>
-          <w:tcPr>
-            <w:tcW w:type="dxa" w:w="960"/>
-          </w:tcPr>
-          <w:p>
-            <w:r>
-              <w:t>17823234</w:t>
-            </w:r>
-          </w:p>
-        </w:tc>
-        <w:tc>
-          <w:tcPr>
-            <w:tcW w:type="dxa" w:w="960"/>
-          </w:tcPr>
-          <w:p>
-            <w:r>
-              <w:t>Atender demanda do 2709</w:t>
-            </w:r>
-          </w:p>
-        </w:tc>
-        <w:tc>
-          <w:tcPr>
-            <w:tcW w:type="dxa" w:w="960"/>
-          </w:tcPr>
-          <w:p>
-            <w:r>
-              <w:t>2709</w:t>
-            </w:r>
-          </w:p>
-        </w:tc>
-        <w:tc>
-          <w:tcPr>
-            <w:tcW w:type="dxa" w:w="960"/>
-          </w:tcPr>
-          <w:p>
-            <w:r>
-              <w:t>BABR</w:t>
-            </w:r>
-          </w:p>
-        </w:tc>
-        <w:tc>
-          <w:tcPr>
-            <w:tcW w:type="dxa" w:w="960"/>
-          </w:tcPr>
-          <w:p>
-            <w:r>
-              <w:t>Pendente</w:t>
-            </w:r>
-          </w:p>
-        </w:tc>
-      </w:tr>
-      <w:tr>
-        <w:tc>
-          <w:tcPr>
-            <w:tcW w:type="dxa" w:w="960"/>
-          </w:tcPr>
-          <w:p>
-            <w:r>
-              <w:t>310</w:t>
-            </w:r>
-          </w:p>
-        </w:tc>
-        <w:tc>
-          <w:tcPr>
-            <w:tcW w:type="dxa" w:w="960"/>
-          </w:tcPr>
-          <w:p>
-            <w:r>
-              <w:t>2662022-1</w:t>
-            </w:r>
-          </w:p>
-        </w:tc>
-        <w:tc>
-          <w:tcPr>
-            <w:tcW w:type="dxa" w:w="960"/>
-          </w:tcPr>
-          <w:p>
-            <w:r>
-              <w:t>TUBE ASSY</w:t>
-            </w:r>
-          </w:p>
-        </w:tc>
-        <w:tc>
-          <w:tcPr>
-            <w:tcW w:type="dxa" w:w="960"/>
-          </w:tcPr>
-          <w:p>
-            <w:r>
-              <w:t>02 EA</w:t>
-            </w:r>
-          </w:p>
-        </w:tc>
-        <w:tc>
-          <w:tcPr>
-            <w:tcW w:type="dxa" w:w="960"/>
-          </w:tcPr>
-          <w:p>
-            <w:r>
-              <w:t>17823235</w:t>
-            </w:r>
-          </w:p>
-        </w:tc>
-        <w:tc>
-          <w:tcPr>
-            <w:tcW w:type="dxa" w:w="960"/>
-          </w:tcPr>
-          <w:p>
-            <w:r>
-              <w:t>Atender demanda do 2709</w:t>
-            </w:r>
-          </w:p>
-        </w:tc>
-        <w:tc>
-          <w:tcPr>
-            <w:tcW w:type="dxa" w:w="960"/>
-          </w:tcPr>
-          <w:p>
-            <w:r>
-              <w:t>2709</w:t>
-            </w:r>
-          </w:p>
-        </w:tc>
-        <w:tc>
-          <w:tcPr>
-            <w:tcW w:type="dxa" w:w="960"/>
-          </w:tcPr>
-          <w:p>
-            <w:r>
-              <w:t>BABR</w:t>
-            </w:r>
-          </w:p>
-        </w:tc>
-        <w:tc>
-          <w:tcPr>
-            <w:tcW w:type="dxa" w:w="960"/>
-          </w:tcPr>
-          <w:p>
-            <w:r>
-              <w:t>Pendente</w:t>
-            </w:r>
-          </w:p>
-        </w:tc>
-      </w:tr>
-      <w:tr>
-        <w:tc>
-          <w:tcPr>
-            <w:tcW w:type="dxa" w:w="960"/>
-          </w:tcPr>
-          <w:p>
-            <w:r>
-              <w:t>311</w:t>
-            </w:r>
-          </w:p>
-        </w:tc>
-        <w:tc>
-          <w:tcPr>
-            <w:tcW w:type="dxa" w:w="960"/>
-          </w:tcPr>
-          <w:p>
-            <w:r>
-              <w:t>AN315-3L</w:t>
-            </w:r>
-          </w:p>
-        </w:tc>
-        <w:tc>
-          <w:tcPr>
-            <w:tcW w:type="dxa" w:w="960"/>
-          </w:tcPr>
-          <w:p>
-            <w:r>
-              <w:t>NUT,PLAIN,HEXAGON</w:t>
-            </w:r>
-          </w:p>
-        </w:tc>
-        <w:tc>
-          <w:tcPr>
-            <w:tcW w:type="dxa" w:w="960"/>
-          </w:tcPr>
-          <w:p>
-            <w:r>
-              <w:t>02 EA</w:t>
-            </w:r>
-          </w:p>
-        </w:tc>
-        <w:tc>
-          <w:tcPr>
-            <w:tcW w:type="dxa" w:w="960"/>
-          </w:tcPr>
-          <w:p>
-            <w:r>
-              <w:t>17823601</w:t>
-            </w:r>
-          </w:p>
-        </w:tc>
-        <w:tc>
-          <w:tcPr>
-            <w:tcW w:type="dxa" w:w="960"/>
-          </w:tcPr>
-          <w:p>
-            <w:r>
-              <w:t>Atender demanda do 2709</w:t>
-            </w:r>
-          </w:p>
-        </w:tc>
-        <w:tc>
-          <w:tcPr>
-            <w:tcW w:type="dxa" w:w="960"/>
-          </w:tcPr>
-          <w:p>
-            <w:r>
-              <w:t>2709</w:t>
-            </w:r>
-          </w:p>
-        </w:tc>
-        <w:tc>
-          <w:tcPr>
-            <w:tcW w:type="dxa" w:w="960"/>
-          </w:tcPr>
-          <w:p>
-            <w:r>
-              <w:t>BABR</w:t>
-            </w:r>
-          </w:p>
-        </w:tc>
-        <w:tc>
-          <w:tcPr>
-            <w:tcW w:type="dxa" w:w="960"/>
-          </w:tcPr>
-          <w:p>
-            <w:r>
-              <w:t>Pendente</w:t>
-            </w:r>
-          </w:p>
-        </w:tc>
-      </w:tr>
-    </w:tbl>
+    <w:p>
+      <w:r>
+        <w:drawing>
+          <wp:inline xmlns:a="http://schemas.openxmlformats.org/drawingml/2006/main" xmlns:pic="http://schemas.openxmlformats.org/drawingml/2006/picture">
+            <wp:extent cx="5943600" cy="4666783"/>
+            <wp:docPr id="1" name="Picture 1"/>
+            <wp:cNvGraphicFramePr>
+              <a:graphicFrameLocks noChangeAspect="1"/>
+            </wp:cNvGraphicFramePr>
+            <a:graphic>
+              <a:graphicData uri="http://schemas.openxmlformats.org/drawingml/2006/picture">
+                <pic:pic>
+                  <pic:nvPicPr>
+                    <pic:cNvPr id="0" name="_anexo_a_emprestimos_2026-06.png"/>
+                    <pic:cNvPicPr/>
+                  </pic:nvPicPr>
+                  <pic:blipFill>
+                    <a:blip r:embed="rId9"/>
+                    <a:stretch>
+                      <a:fillRect/>
+                    </a:stretch>
+                  </pic:blipFill>
+                  <pic:spPr>
+                    <a:xfrm>
+                      <a:off x="0" y="0"/>
+                      <a:ext cx="5943600" cy="4666783"/>
+                    </a:xfrm>
+                    <a:prstGeom prst="rect"/>
+                  </pic:spPr>
+                </pic:pic>
+              </a:graphicData>
+            </a:graphic>
+          </wp:inline>
+        </w:drawing>
+      </w:r>
+    </w:p>
     <w:p>
       <w:r>
         <w:br w:type="page"/>
@@ -29083,7 +24566,7 @@
         <w:rPr>
           <w:b w:val="0"/>
         </w:rPr>
-        <w:t xml:space="preserve"> Foi iniciada a apresentação da RMA, estavam presentes o proposto da empresa, Paulo, a nova representante da empresa, Desi Rê, o Rezende, o Claudio, os propostos da GoSanta e representantes da FAB, o Tenente Wallace, fiscal, e o Sargento Ramon auxiliar. O objetivo foi apresentar a medimensal de aeronaves no mês de junho, foi apresentado um extrato do mês, onde a medimensal de aeronaves montadas foi 90,29, pontuação máxima obtida 623, pontuação obtida 623,690, índice final de imprensa é 095. Aí eu passei pelas aeronaves conforme slide, FAB 2709, com as emergências relacionadas, que é o 2721, que está em negrito, é a segunda, então, você vai ler a emergência 19.148 final, e aí ela passou, ela foi até o dia 11, né, aí depois foi o 2721, vamos ler as emergências do 21, lê as emergências do FAB 2723, lê as emergências do FAB 2729, lê as emergências do FAB 2738 e lê as emergências do FAB 2739. Sobre 2739, apesar dela ter sido cancelada pelo próprio operador no dia 1 do 7, né, ela foi recebida no dia 26 do 6 através do recibo 02 G-Log Belém, mas assim, teve a questão da, depois, né, que o pessoal recebesse, eu observo algumas discrepâncias, mas essas discrepâncias passaram por análise da Engenharia de São Paulo, então, por conta disso, né, a empresa não sabe, a FAB não sabe se eu ia utilizar aquela FCU ou não, eu achei justo, é, contar montada até aquela data específica, né, por conta que eu não falei nada com a empresa, ela, então, ela achou que tinha recebido, apesar de saber que nos bastidores ela sabia dessa discrepância aí, e aí voltou, apresentou um desempenho, foi apresentado total de novo, teve 830 horas e 35 minutos aplicando índice 1.340.863,42, foi apresentadas notas fiscais, o extrato dos sinlomes, o proposto perguntou sobre as notas de liquidação, eu falei que eu vou tentar mandar para eles quais são essas notas liquidadas ali, para que eu sei que gera uma confusão lá de pagamento, foi apresentado um extrato geral, mas pouco visual, das coisas que estão pendentes, então, é só o módulo 1, sobre o módulo 2, né, a gente tem aí guardando os itens, né, é o orçamento 01 de 2026 e eu enviei o orçamento 03 de 2026 foi uma aprovação parcial, não sei se o texto ficou correto, só tirei os conjuntos de freios, dois, no valor de R$24.962,38, acho que houve uma confusão de valores, mas eu estou à disposição para corrigir se eu tiver feito errado também, foi apresentados empréstimos em junho, do mês de junho, e aí eu apresentei um panorama geral, onde está escrito total de itens, mas onde lê total de itens é o total de linhas, total de pedidos, né, não está atrado ao total de pedidos, né, então teve com relação aos empréstimos, né, eu fiquei de disponibilizar também para a empresa, além dos prepostos que estão em sete, já tem essa planilha, o fiscal acha que o Roberto Carlos já tem essa planilha aí também. O uso reparável é apresentado, tem 323 em OS, mas dessas 323 aí tem alguns que já foram entregues, pela própria V1 já colocou onde elas estão, a princípio em OS214, né, lembrando aí que tudo que está em OS a partir do dia 1,7, a gente vai cobrar aí o TAT, e os que não estão em OS, o UPR, por ser ainda está definindo aí, entregando os itens que estão com ele, né, que já passou o TAT. Então aí teve, foi apresentado aí as emergências entregues, entregues ao concluído no mês, né, em centagem, então teve um total de 39 entregas, 29 no prazo, totalizando em um QD mensal de 74. O preposto, ele passou a falar, ele falou sobre, citou um caso da FCU, ele fez a leitura do FCU, de um relatório da LIP, falando que o item quando ele está incompleto, ele fica mais caro, ele exemplificou com um caso específico de um SN, fez a leitura completa, mostrando como que a FCU chega, né, o fiscal falou que o estado de saída da FCU, para a empresa reparar, ela tem que reparar do jeito que ela pegar e entre em condições, mais uma vez que ela entregou o item em condições, se aquele item apresentar defeito, o item ele tem que ser recolhido completo, se a empresa entregou completo, devolver o produto, né, se isso não está acontecendo, está errado, a gente vai buscar corrigir, orientar os operadores, e aí foi lida uma proposta de mapem que a gente vai analisar, que a gente tem que ver ali quais são as implicações que a gente tem para aquele mapem, sem mais nada, foi aproveitado a comunidade para apresentar a Desiree, nova colaboradora da empresa, não tendo mais nada a falar, foi para terminar da reunião.</w:t>
+        <w:t>﻿Foi iniciada a apresentação da RMA estavam presentes o preposto da empresa Paulo O a nova a nova representante da empresa a D. O Resende e o Cláudio os preposição da Laa Santa e o representantes da FB o Tenente Wallace fiscal e o sargento Ramon auxiliar. O objetivo foi apresentar a minha dimensão da aerálise do mês de junho foi apresentado um extrato Do mês onde a média mensal de aeronaves montadas foi 90,29 pontuação máxima obtida 623.  Pouação obtida 623 de 690 índice de final desempenho 095. Aí eu passei pelas aeronaves conforme slide Fabio 27 09 com as emergências relacionadas com 2721 que tá em negrito é a segunda então e a você avalia a A emergência 19148 final e aí ela passou ela foi até o dia 11 né aí depois foi o 2721 vamo ler emergências do 21 Leia as emergências do Fábio 2723 leia as emergências do Fábio 2729 leia as emergências do Fábio 2738 e leia as emergências do Fábio 2739 sobre o 2739 apesar dela ter sido cancelada pelo próprio operador no dia um do sete ela foi recebida no dia 20 no dia 26/6 através do recibo 02 Gog Belém mas assim teve a questão da depois né que o pessoal recebeu observou algumas discrepâncias. Mas essas discrepâncias elas passaram por análise da engenharia de São Paulo então por conta disso né esse a empresa não sabe a Fabio não sabia se ia utilizar aquela UFCU ou não eu achei justo como tá montada até aquela data específica né por conta que eu não falei nada com a empresa ela então ela achou que tinha recebido Apesar de saber que ia nos bastidores ela sabia dessa discrepância aí e aí voltou apresentou o índice desempenta total de novo teve 83035. aplicando o índice 1.340.863 e 42.  Foi apresentado as notas fiscais o status dosmes o proposto perguntou sobre as notas de liquidação eu falei que eu vou tentar mandar pra eles quais são essas notas de liquidados ali pra que eu sei que gera uma confusão lá de pagamento foi apresentado um extrato geral mas pouco visual dos do das coisas tão pendentes então é só o módulo um módulo sobre o módulo dois né a gente tem aí guardando os itens né é o orçamento zero de 2026 e eu enviei o orçamento 03 de 2026 também foi uma aprovação parcial não sei se o texto ficou correto só tirei o os conjuntos de de frei os dois no valor de4.962 38 acho que houve uma confusão de valores mas eu estou à disposição para corrigir se eu tiver feito errado também. Foi apresentado os empréstimos em junho Do mês de junho e aí eu apresentei um panorama geral onde estava escrito total de itens mas onde lê total de itens é o total de linhas total de pedidos né não tá atado ao total de pedidos né então teve Com relacionado aos empréstimos né. Eu fiquei de disponibilizar também pra empresa além dos prepostos que estão em sede que já tenha essa essa planilha.  O fiscal acha que o Roberto Carlos já tem essa essa planilha aí também. Os reparáveis que apresentado tem 323 em oS mas dessas 323 aí tem algumas que já foram entregues pela própria a própria já colocou antes que elas elas estão a princípio em iOS 214 né lembrando aí da que tudo que for sair em iOS a partir do dia um do sete a gente vai cobrar aí o O TAT e os que não estão a S o prep ainda tá definindo aí vem entregando os itens que tão com eles né que já passou o tempo. Então aí teve foi apresentado aí as emergências entregues entregues ou concluídos no mês né a porcentagem então teve um total de R$ 39 entregas 29 no prazo totalizando aí um QD mensal de 74.  O preposto ele passou a falar ele falou sobre É citou um caso da FCU ele fez a leitura do FCU de um relatório da Lipe falando que o item con ele tá incompleto ele fica mais caro ele exemplificou com ele com um caso específico de um d dum SN fez a leitura completa. mostrando como que a FC os chega né o o fiscal falou que a o estado de saída da da FCU pra empresa reparar ela tem que reparar do jeito que ela pegar e entrar em condições mas uma vez que ela entregou o item em condições se aquele item apresentado defeito o item ele tem que se recolhido completo se a empresa entregou completo e devolver completo né e se isso não tá acontecendo tá errado a gente vai a gente vai A gente vai é buscar corrigir né e a orientar os operadores e aí foi foi lida uma proposta de Mapem que a gente vai analisar que a gente tem que ver ali quais são as implicações que a gente tem pra pra aquele mapaem. sem mais nada foi aproveitado a oportunidade para apresentar a Desiree a nova colaboradora da empresa. Não tendo mais nada mais nada a se falar foi pra terminada a reunião.</w:t>
       </w:r>
     </w:p>
     <w:sectPr>

</xml_diff>

<commit_message>
Corrige crash em produção: PN com tipo misto (int/str) quebrava sorted()
Depois da atualização de Reparáveis, uma OS nova tinha PN só numérico,
que o openpyxl lê como int em vez de str — a coluna "pn" ficou com
tipos mistos, e sorted(df["pn"].dropna().unique()) quebrava com
TypeError direto no Streamlit Cloud. Mesma causa quebrava a conversão
pra Arrow do st.dataframe.

Correção em duas camadas: (1) normaliza PN pra string na extração
(extrair_reparaveis.py, extrair_emergencias.py — parse_texto_pn), raiz
do problema; (2) troca todo `sorted(df[col].dropna().unique())` por um
helper novo (components/utils.py::ordenar_unicos, ordena por
representação em string) nas 7 telas que tinham o mesmo padrão frágil,
defensivo contra o mesmo tipo de dado sujo em qualquer coluna.

Co-Authored-By: Claude Sonnet 5 <noreply@anthropic.com>
</commit_message>
<xml_diff>
--- a/Contrato 005/Dashboard/02_Dados_Tratados/atas/Ata_RMA_Junho_2026_rascunho.docx
+++ b/Contrato 005/Dashboard/02_Dados_Tratados/atas/Ata_RMA_Junho_2026_rascunho.docx
@@ -841,7 +841,7 @@
         <w:rPr>
           <w:b w:val="0"/>
         </w:rPr>
-        <w:t>Foi retomado o assunto do controle de reparáveis: 323 Ordem(ns) de Serviço em aberto no momento da extração. O controle completo consta no Anexo B desta ata.</w:t>
+        <w:t>Foi retomado o assunto do controle de reparáveis: 324 Ordem(ns) de Serviço em aberto no momento da extração. O controle completo consta no Anexo B desta ata.</w:t>
       </w:r>
     </w:p>
     <w:p>
@@ -1437,7 +1437,7 @@
       <w:r>
         <w:drawing>
           <wp:inline xmlns:a="http://schemas.openxmlformats.org/drawingml/2006/main" xmlns:pic="http://schemas.openxmlformats.org/drawingml/2006/picture">
-            <wp:extent cx="5943600" cy="4381061"/>
+            <wp:extent cx="5943600" cy="4383256"/>
             <wp:docPr id="7" name="Picture 7"/>
             <wp:cNvGraphicFramePr>
               <a:graphicFrameLocks noChangeAspect="1"/>
@@ -1458,7 +1458,7 @@
                   <pic:spPr>
                     <a:xfrm>
                       <a:off x="0" y="0"/>
-                      <a:ext cx="5943600" cy="4381061"/>
+                      <a:ext cx="5943600" cy="4383256"/>
                     </a:xfrm>
                     <a:prstGeom prst="rect"/>
                   </pic:spPr>
@@ -1535,7 +1535,7 @@
       <w:r>
         <w:drawing>
           <wp:inline xmlns:a="http://schemas.openxmlformats.org/drawingml/2006/main" xmlns:pic="http://schemas.openxmlformats.org/drawingml/2006/picture">
-            <wp:extent cx="5943600" cy="4381061"/>
+            <wp:extent cx="5943600" cy="4383256"/>
             <wp:docPr id="9" name="Picture 9"/>
             <wp:cNvGraphicFramePr>
               <a:graphicFrameLocks noChangeAspect="1"/>
@@ -1556,7 +1556,7 @@
                   <pic:spPr>
                     <a:xfrm>
                       <a:off x="0" y="0"/>
-                      <a:ext cx="5943600" cy="4381061"/>
+                      <a:ext cx="5943600" cy="4383256"/>
                     </a:xfrm>
                     <a:prstGeom prst="rect"/>
                   </pic:spPr>
@@ -1584,7 +1584,7 @@
       <w:r>
         <w:drawing>
           <wp:inline xmlns:a="http://schemas.openxmlformats.org/drawingml/2006/main" xmlns:pic="http://schemas.openxmlformats.org/drawingml/2006/picture">
-            <wp:extent cx="5943600" cy="857164"/>
+            <wp:extent cx="5943600" cy="952882"/>
             <wp:docPr id="10" name="Picture 10"/>
             <wp:cNvGraphicFramePr>
               <a:graphicFrameLocks noChangeAspect="1"/>
@@ -1605,7 +1605,7 @@
                   <pic:spPr>
                     <a:xfrm>
                       <a:off x="0" y="0"/>
-                      <a:ext cx="5943600" cy="857164"/>
+                      <a:ext cx="5943600" cy="952882"/>
                     </a:xfrm>
                     <a:prstGeom prst="rect"/>
                   </pic:spPr>

</xml_diff>